<commit_message>
added search engine files
</commit_message>
<xml_diff>
--- a/Project-Plan.docx
+++ b/Project-Plan.docx
@@ -170,19 +170,7 @@
         <w:rPr>
           <w:rFonts w:ascii="Times New Roman" w:hAnsi="Times New Roman" w:cs="Times New Roman"/>
         </w:rPr>
-        <w:t>5. NLP → Agent B</w:t>
-      </w:r>
-      <w:r>
-        <w:rPr>
-          <w:rFonts w:ascii="Times New Roman" w:hAnsi="Times New Roman" w:cs="Times New Roman"/>
-        </w:rPr>
-        <w:t>l</w:t>
-      </w:r>
-      <w:r>
-        <w:rPr>
-          <w:rFonts w:ascii="Times New Roman" w:hAnsi="Times New Roman" w:cs="Times New Roman"/>
-        </w:rPr>
-        <w:t>ueprint</w:t>
+        <w:t>5. NLP → Agent Blueprint</w:t>
       </w:r>
     </w:p>
     <w:p>
@@ -431,7 +419,21 @@
         <w:rPr>
           <w:rFonts w:ascii="Times New Roman" w:hAnsi="Times New Roman" w:cs="Times New Roman"/>
         </w:rPr>
-        <w:t xml:space="preserve"> Foundry: templates, a business-friendly creation experience, tool/data catalogs, policy enforcement, approval workflows, evaluation, identity, observability and lifecycle management.</w:t>
+        <w:t xml:space="preserve"> Foundry: templates, a business-friendly creation experience, tool/data </w:t>
+      </w:r>
+      <w:proofErr w:type="spellStart"/>
+      <w:r>
+        <w:rPr>
+          <w:rFonts w:ascii="Times New Roman" w:hAnsi="Times New Roman" w:cs="Times New Roman"/>
+        </w:rPr>
+        <w:t>catalogs</w:t>
+      </w:r>
+      <w:proofErr w:type="spellEnd"/>
+      <w:r>
+        <w:rPr>
+          <w:rFonts w:ascii="Times New Roman" w:hAnsi="Times New Roman" w:cs="Times New Roman"/>
+        </w:rPr>
+        <w:t>, policy enforcement, approval workflows, evaluation, identity, observability and lifecycle management.</w:t>
       </w:r>
     </w:p>
     <w:p>
@@ -731,6 +733,7 @@
           <w:rFonts w:ascii="Times New Roman" w:hAnsi="Times New Roman" w:cs="Times New Roman"/>
           <w:b/>
           <w:bCs/>
+          <w:noProof/>
         </w:rPr>
         <w:lastRenderedPageBreak/>
         <w:drawing>
@@ -749,7 +752,7 @@
                     <pic:cNvPicPr/>
                   </pic:nvPicPr>
                   <pic:blipFill>
-                    <a:blip r:embed="rId5"/>
+                    <a:blip r:embed="rId6"/>
                     <a:stretch>
                       <a:fillRect/>
                     </a:stretch>
@@ -972,8 +975,16 @@
               <w:rPr>
                 <w:rFonts w:ascii="Times New Roman" w:hAnsi="Times New Roman" w:cs="Times New Roman"/>
               </w:rPr>
-              <w:t>NL agent creation, forms, templates, test, submit, status, catalog</w:t>
-            </w:r>
+              <w:t xml:space="preserve">NL agent creation, forms, templates, test, submit, status, </w:t>
+            </w:r>
+            <w:proofErr w:type="spellStart"/>
+            <w:r>
+              <w:rPr>
+                <w:rFonts w:ascii="Times New Roman" w:hAnsi="Times New Roman" w:cs="Times New Roman"/>
+              </w:rPr>
+              <w:t>catalog</w:t>
+            </w:r>
+            <w:proofErr w:type="spellEnd"/>
           </w:p>
         </w:tc>
       </w:tr>
@@ -1433,35 +1444,57 @@
               <w:rPr>
                 <w:rFonts w:ascii="Times New Roman" w:hAnsi="Times New Roman" w:cs="Times New Roman"/>
               </w:rPr>
-              <w:t>Tool catalog</w:t>
-            </w:r>
-          </w:p>
-        </w:tc>
-        <w:tc>
-          <w:tcPr>
-            <w:tcW w:w="0" w:type="auto"/>
-            <w:tcBorders>
-              <w:bottom w:val="single" w:sz="4" w:space="0" w:color="444441"/>
-            </w:tcBorders>
-            <w:tcMar>
-              <w:top w:w="135" w:type="dxa"/>
-              <w:left w:w="150" w:type="dxa"/>
-              <w:bottom w:w="135" w:type="dxa"/>
-              <w:right w:w="150" w:type="dxa"/>
-            </w:tcMar>
-            <w:hideMark/>
-          </w:tcPr>
-          <w:p>
-            <w:pPr>
-              <w:rPr>
-                <w:rFonts w:ascii="Times New Roman" w:hAnsi="Times New Roman" w:cs="Times New Roman"/>
-              </w:rPr>
-            </w:pPr>
-            <w:r>
-              <w:rPr>
-                <w:rFonts w:ascii="Times New Roman" w:hAnsi="Times New Roman" w:cs="Times New Roman"/>
-              </w:rPr>
-              <w:t>Azure API Center + approved MCP/API tools</w:t>
+              <w:t xml:space="preserve">Tool </w:t>
+            </w:r>
+            <w:proofErr w:type="spellStart"/>
+            <w:r>
+              <w:rPr>
+                <w:rFonts w:ascii="Times New Roman" w:hAnsi="Times New Roman" w:cs="Times New Roman"/>
+              </w:rPr>
+              <w:t>catalog</w:t>
+            </w:r>
+            <w:proofErr w:type="spellEnd"/>
+          </w:p>
+        </w:tc>
+        <w:tc>
+          <w:tcPr>
+            <w:tcW w:w="0" w:type="auto"/>
+            <w:tcBorders>
+              <w:bottom w:val="single" w:sz="4" w:space="0" w:color="444441"/>
+            </w:tcBorders>
+            <w:tcMar>
+              <w:top w:w="135" w:type="dxa"/>
+              <w:left w:w="150" w:type="dxa"/>
+              <w:bottom w:w="135" w:type="dxa"/>
+              <w:right w:w="150" w:type="dxa"/>
+            </w:tcMar>
+            <w:hideMark/>
+          </w:tcPr>
+          <w:p>
+            <w:pPr>
+              <w:rPr>
+                <w:rFonts w:ascii="Times New Roman" w:hAnsi="Times New Roman" w:cs="Times New Roman"/>
+              </w:rPr>
+            </w:pPr>
+            <w:r>
+              <w:rPr>
+                <w:rFonts w:ascii="Times New Roman" w:hAnsi="Times New Roman" w:cs="Times New Roman"/>
+              </w:rPr>
+              <w:t xml:space="preserve">Azure API </w:t>
+            </w:r>
+            <w:proofErr w:type="spellStart"/>
+            <w:r>
+              <w:rPr>
+                <w:rFonts w:ascii="Times New Roman" w:hAnsi="Times New Roman" w:cs="Times New Roman"/>
+              </w:rPr>
+              <w:t>Center</w:t>
+            </w:r>
+            <w:proofErr w:type="spellEnd"/>
+            <w:r>
+              <w:rPr>
+                <w:rFonts w:ascii="Times New Roman" w:hAnsi="Times New Roman" w:cs="Times New Roman"/>
+              </w:rPr>
+              <w:t xml:space="preserve"> + approved MCP/API tools</w:t>
             </w:r>
           </w:p>
         </w:tc>
@@ -1866,7 +1899,21 @@
         <w:rPr>
           <w:rFonts w:ascii="Times New Roman" w:hAnsi="Times New Roman" w:cs="Times New Roman"/>
         </w:rPr>
-        <w:t>Should read as an enterprise service catalog, not an Azure admin console.</w:t>
+        <w:t xml:space="preserve">Should read as an enterprise service </w:t>
+      </w:r>
+      <w:proofErr w:type="spellStart"/>
+      <w:r>
+        <w:rPr>
+          <w:rFonts w:ascii="Times New Roman" w:hAnsi="Times New Roman" w:cs="Times New Roman"/>
+        </w:rPr>
+        <w:t>catalog</w:t>
+      </w:r>
+      <w:proofErr w:type="spellEnd"/>
+      <w:r>
+        <w:rPr>
+          <w:rFonts w:ascii="Times New Roman" w:hAnsi="Times New Roman" w:cs="Times New Roman"/>
+        </w:rPr>
+        <w:t>, not an Azure admin console.</w:t>
       </w:r>
     </w:p>
     <w:p>
@@ -1941,7 +1988,21 @@
         <w:rPr>
           <w:rFonts w:ascii="Times New Roman" w:hAnsi="Times New Roman" w:cs="Times New Roman"/>
         </w:rPr>
-        <w:t xml:space="preserve"> — searchable catalog of sources the user is entitled to select</w:t>
+        <w:t xml:space="preserve"> — searchable </w:t>
+      </w:r>
+      <w:proofErr w:type="spellStart"/>
+      <w:r>
+        <w:rPr>
+          <w:rFonts w:ascii="Times New Roman" w:hAnsi="Times New Roman" w:cs="Times New Roman"/>
+        </w:rPr>
+        <w:t>catalog</w:t>
+      </w:r>
+      <w:proofErr w:type="spellEnd"/>
+      <w:r>
+        <w:rPr>
+          <w:rFonts w:ascii="Times New Roman" w:hAnsi="Times New Roman" w:cs="Times New Roman"/>
+        </w:rPr>
+        <w:t xml:space="preserve"> of sources the user is entitled to select</w:t>
       </w:r>
     </w:p>
     <w:p>
@@ -1966,7 +2027,21 @@
         <w:rPr>
           <w:rFonts w:ascii="Times New Roman" w:hAnsi="Times New Roman" w:cs="Times New Roman"/>
         </w:rPr>
-        <w:t xml:space="preserve"> — searchable tool catalog, permission-aware filtering</w:t>
+        <w:t xml:space="preserve"> — searchable tool </w:t>
+      </w:r>
+      <w:proofErr w:type="spellStart"/>
+      <w:r>
+        <w:rPr>
+          <w:rFonts w:ascii="Times New Roman" w:hAnsi="Times New Roman" w:cs="Times New Roman"/>
+        </w:rPr>
+        <w:t>catalog</w:t>
+      </w:r>
+      <w:proofErr w:type="spellEnd"/>
+      <w:r>
+        <w:rPr>
+          <w:rFonts w:ascii="Times New Roman" w:hAnsi="Times New Roman" w:cs="Times New Roman"/>
+        </w:rPr>
+        <w:t>, permission-aware filtering</w:t>
       </w:r>
     </w:p>
     <w:p>
@@ -2160,7 +2235,21 @@
         <w:rPr>
           <w:rFonts w:ascii="Times New Roman" w:hAnsi="Times New Roman" w:cs="Times New Roman"/>
         </w:rPr>
-        <w:t xml:space="preserve"> blueprint — approved templates and the tool/data catalog bound what it can produce; it cannot invent connectors, permissions, or security settings.</w:t>
+        <w:t xml:space="preserve"> blueprint — approved templates and the tool/data </w:t>
+      </w:r>
+      <w:proofErr w:type="spellStart"/>
+      <w:r>
+        <w:rPr>
+          <w:rFonts w:ascii="Times New Roman" w:hAnsi="Times New Roman" w:cs="Times New Roman"/>
+        </w:rPr>
+        <w:t>catalog</w:t>
+      </w:r>
+      <w:proofErr w:type="spellEnd"/>
+      <w:r>
+        <w:rPr>
+          <w:rFonts w:ascii="Times New Roman" w:hAnsi="Times New Roman" w:cs="Times New Roman"/>
+        </w:rPr>
+        <w:t xml:space="preserve"> bound what it can produce; it cannot invent connectors, permissions, or security settings.</w:t>
       </w:r>
     </w:p>
     <w:p>
@@ -2226,33 +2315,75 @@
         <w:rPr>
           <w:rFonts w:ascii="Times New Roman" w:hAnsi="Times New Roman" w:cs="Times New Roman"/>
         </w:rPr>
-        <w:t xml:space="preserve">  "pattern": "knowledge_action",</w:t>
-      </w:r>
-    </w:p>
-    <w:p>
-      <w:pPr>
-        <w:rPr>
-          <w:rFonts w:ascii="Times New Roman" w:hAnsi="Times New Roman" w:cs="Times New Roman"/>
-        </w:rPr>
-      </w:pPr>
-      <w:r>
-        <w:rPr>
-          <w:rFonts w:ascii="Times New Roman" w:hAnsi="Times New Roman" w:cs="Times New Roman"/>
-        </w:rPr>
-        <w:t xml:space="preserve">  "modelPolicy": "approved-general-enterprise",</w:t>
-      </w:r>
-    </w:p>
-    <w:p>
-      <w:pPr>
-        <w:rPr>
-          <w:rFonts w:ascii="Times New Roman" w:hAnsi="Times New Roman" w:cs="Times New Roman"/>
-        </w:rPr>
-      </w:pPr>
-      <w:r>
-        <w:rPr>
-          <w:rFonts w:ascii="Times New Roman" w:hAnsi="Times New Roman" w:cs="Times New Roman"/>
-        </w:rPr>
-        <w:t xml:space="preserve">  "knowledgeSources": ["HR-SharePoint-Leave"],</w:t>
+        <w:t xml:space="preserve">  "pattern": "</w:t>
+      </w:r>
+      <w:proofErr w:type="spellStart"/>
+      <w:r>
+        <w:rPr>
+          <w:rFonts w:ascii="Times New Roman" w:hAnsi="Times New Roman" w:cs="Times New Roman"/>
+        </w:rPr>
+        <w:t>knowledge_action</w:t>
+      </w:r>
+      <w:proofErr w:type="spellEnd"/>
+      <w:r>
+        <w:rPr>
+          <w:rFonts w:ascii="Times New Roman" w:hAnsi="Times New Roman" w:cs="Times New Roman"/>
+        </w:rPr>
+        <w:t>",</w:t>
+      </w:r>
+    </w:p>
+    <w:p>
+      <w:pPr>
+        <w:rPr>
+          <w:rFonts w:ascii="Times New Roman" w:hAnsi="Times New Roman" w:cs="Times New Roman"/>
+        </w:rPr>
+      </w:pPr>
+      <w:r>
+        <w:rPr>
+          <w:rFonts w:ascii="Times New Roman" w:hAnsi="Times New Roman" w:cs="Times New Roman"/>
+        </w:rPr>
+        <w:t xml:space="preserve">  "</w:t>
+      </w:r>
+      <w:proofErr w:type="spellStart"/>
+      <w:r>
+        <w:rPr>
+          <w:rFonts w:ascii="Times New Roman" w:hAnsi="Times New Roman" w:cs="Times New Roman"/>
+        </w:rPr>
+        <w:t>modelPolicy</w:t>
+      </w:r>
+      <w:proofErr w:type="spellEnd"/>
+      <w:r>
+        <w:rPr>
+          <w:rFonts w:ascii="Times New Roman" w:hAnsi="Times New Roman" w:cs="Times New Roman"/>
+        </w:rPr>
+        <w:t>": "approved-general-enterprise",</w:t>
+      </w:r>
+    </w:p>
+    <w:p>
+      <w:pPr>
+        <w:rPr>
+          <w:rFonts w:ascii="Times New Roman" w:hAnsi="Times New Roman" w:cs="Times New Roman"/>
+        </w:rPr>
+      </w:pPr>
+      <w:r>
+        <w:rPr>
+          <w:rFonts w:ascii="Times New Roman" w:hAnsi="Times New Roman" w:cs="Times New Roman"/>
+        </w:rPr>
+        <w:t xml:space="preserve">  "</w:t>
+      </w:r>
+      <w:proofErr w:type="spellStart"/>
+      <w:r>
+        <w:rPr>
+          <w:rFonts w:ascii="Times New Roman" w:hAnsi="Times New Roman" w:cs="Times New Roman"/>
+        </w:rPr>
+        <w:t>knowledgeSources</w:t>
+      </w:r>
+      <w:proofErr w:type="spellEnd"/>
+      <w:r>
+        <w:rPr>
+          <w:rFonts w:ascii="Times New Roman" w:hAnsi="Times New Roman" w:cs="Times New Roman"/>
+        </w:rPr>
+        <w:t>": ["HR-SharePoint-Leave"],</w:t>
       </w:r>
     </w:p>
     <w:p>
@@ -2291,33 +2422,75 @@
         <w:rPr>
           <w:rFonts w:ascii="Times New Roman" w:hAnsi="Times New Roman" w:cs="Times New Roman"/>
         </w:rPr>
-        <w:t xml:space="preserve">  "dataClassification": "HR-Sensitive",</w:t>
-      </w:r>
-    </w:p>
-    <w:p>
-      <w:pPr>
-        <w:rPr>
-          <w:rFonts w:ascii="Times New Roman" w:hAnsi="Times New Roman" w:cs="Times New Roman"/>
-        </w:rPr>
-      </w:pPr>
-      <w:r>
-        <w:rPr>
-          <w:rFonts w:ascii="Times New Roman" w:hAnsi="Times New Roman" w:cs="Times New Roman"/>
-        </w:rPr>
-        <w:t xml:space="preserve">  "humanApproval": true,</w:t>
-      </w:r>
-    </w:p>
-    <w:p>
-      <w:pPr>
-        <w:rPr>
-          <w:rFonts w:ascii="Times New Roman" w:hAnsi="Times New Roman" w:cs="Times New Roman"/>
-        </w:rPr>
-      </w:pPr>
-      <w:r>
-        <w:rPr>
-          <w:rFonts w:ascii="Times New Roman" w:hAnsi="Times New Roman" w:cs="Times New Roman"/>
-        </w:rPr>
-        <w:t xml:space="preserve">  "externalSharing": false,</w:t>
+        <w:t xml:space="preserve">  "</w:t>
+      </w:r>
+      <w:proofErr w:type="spellStart"/>
+      <w:r>
+        <w:rPr>
+          <w:rFonts w:ascii="Times New Roman" w:hAnsi="Times New Roman" w:cs="Times New Roman"/>
+        </w:rPr>
+        <w:t>dataClassification</w:t>
+      </w:r>
+      <w:proofErr w:type="spellEnd"/>
+      <w:r>
+        <w:rPr>
+          <w:rFonts w:ascii="Times New Roman" w:hAnsi="Times New Roman" w:cs="Times New Roman"/>
+        </w:rPr>
+        <w:t>": "HR-Sensitive",</w:t>
+      </w:r>
+    </w:p>
+    <w:p>
+      <w:pPr>
+        <w:rPr>
+          <w:rFonts w:ascii="Times New Roman" w:hAnsi="Times New Roman" w:cs="Times New Roman"/>
+        </w:rPr>
+      </w:pPr>
+      <w:r>
+        <w:rPr>
+          <w:rFonts w:ascii="Times New Roman" w:hAnsi="Times New Roman" w:cs="Times New Roman"/>
+        </w:rPr>
+        <w:t xml:space="preserve">  "</w:t>
+      </w:r>
+      <w:proofErr w:type="spellStart"/>
+      <w:r>
+        <w:rPr>
+          <w:rFonts w:ascii="Times New Roman" w:hAnsi="Times New Roman" w:cs="Times New Roman"/>
+        </w:rPr>
+        <w:t>humanApproval</w:t>
+      </w:r>
+      <w:proofErr w:type="spellEnd"/>
+      <w:r>
+        <w:rPr>
+          <w:rFonts w:ascii="Times New Roman" w:hAnsi="Times New Roman" w:cs="Times New Roman"/>
+        </w:rPr>
+        <w:t>": true,</w:t>
+      </w:r>
+    </w:p>
+    <w:p>
+      <w:pPr>
+        <w:rPr>
+          <w:rFonts w:ascii="Times New Roman" w:hAnsi="Times New Roman" w:cs="Times New Roman"/>
+        </w:rPr>
+      </w:pPr>
+      <w:r>
+        <w:rPr>
+          <w:rFonts w:ascii="Times New Roman" w:hAnsi="Times New Roman" w:cs="Times New Roman"/>
+        </w:rPr>
+        <w:t xml:space="preserve">  "</w:t>
+      </w:r>
+      <w:proofErr w:type="spellStart"/>
+      <w:r>
+        <w:rPr>
+          <w:rFonts w:ascii="Times New Roman" w:hAnsi="Times New Roman" w:cs="Times New Roman"/>
+        </w:rPr>
+        <w:t>externalSharing</w:t>
+      </w:r>
+      <w:proofErr w:type="spellEnd"/>
+      <w:r>
+        <w:rPr>
+          <w:rFonts w:ascii="Times New Roman" w:hAnsi="Times New Roman" w:cs="Times New Roman"/>
+        </w:rPr>
+        <w:t>": false,</w:t>
       </w:r>
     </w:p>
     <w:p>
@@ -2356,7 +2529,21 @@
         <w:rPr>
           <w:rFonts w:ascii="Times New Roman" w:hAnsi="Times New Roman" w:cs="Times New Roman"/>
         </w:rPr>
-        <w:t xml:space="preserve">  "reviewPeriodDays": 180</w:t>
+        <w:t xml:space="preserve">  "</w:t>
+      </w:r>
+      <w:proofErr w:type="spellStart"/>
+      <w:r>
+        <w:rPr>
+          <w:rFonts w:ascii="Times New Roman" w:hAnsi="Times New Roman" w:cs="Times New Roman"/>
+        </w:rPr>
+        <w:t>reviewPeriodDays</w:t>
+      </w:r>
+      <w:proofErr w:type="spellEnd"/>
+      <w:r>
+        <w:rPr>
+          <w:rFonts w:ascii="Times New Roman" w:hAnsi="Times New Roman" w:cs="Times New Roman"/>
+        </w:rPr>
+        <w:t>": 180</w:t>
       </w:r>
     </w:p>
     <w:p>
@@ -2497,7 +2684,21 @@
         <w:rPr>
           <w:rFonts w:ascii="Times New Roman" w:hAnsi="Times New Roman" w:cs="Times New Roman"/>
         </w:rPr>
-        <w:t>Tools — present in the approved tool catalog?</w:t>
+        <w:t xml:space="preserve">Tools — present in the approved tool </w:t>
+      </w:r>
+      <w:proofErr w:type="spellStart"/>
+      <w:r>
+        <w:rPr>
+          <w:rFonts w:ascii="Times New Roman" w:hAnsi="Times New Roman" w:cs="Times New Roman"/>
+        </w:rPr>
+        <w:t>catalog</w:t>
+      </w:r>
+      <w:proofErr w:type="spellEnd"/>
+      <w:r>
+        <w:rPr>
+          <w:rFonts w:ascii="Times New Roman" w:hAnsi="Times New Roman" w:cs="Times New Roman"/>
+        </w:rPr>
+        <w:t>?</w:t>
       </w:r>
     </w:p>
     <w:p>
@@ -3339,7 +3540,21 @@
               <w:rPr>
                 <w:rFonts w:ascii="Times New Roman" w:hAnsi="Times New Roman" w:cs="Times New Roman"/>
               </w:rPr>
-              <w:t>Factory UX, templates, business taxonomy, policy orchestration, approval workflows, tool catalog design, integrations, dashboards, managed service</w:t>
+              <w:t xml:space="preserve">Factory UX, templates, business taxonomy, policy orchestration, approval workflows, tool </w:t>
+            </w:r>
+            <w:proofErr w:type="spellStart"/>
+            <w:r>
+              <w:rPr>
+                <w:rFonts w:ascii="Times New Roman" w:hAnsi="Times New Roman" w:cs="Times New Roman"/>
+              </w:rPr>
+              <w:t>catalog</w:t>
+            </w:r>
+            <w:proofErr w:type="spellEnd"/>
+            <w:r>
+              <w:rPr>
+                <w:rFonts w:ascii="Times New Roman" w:hAnsi="Times New Roman" w:cs="Times New Roman"/>
+              </w:rPr>
+              <w:t xml:space="preserve"> design, integrations, dashboards, managed service</w:t>
             </w:r>
           </w:p>
         </w:tc>
@@ -3421,7 +3636,21 @@
         <w:rPr>
           <w:rFonts w:ascii="Times New Roman" w:hAnsi="Times New Roman" w:cs="Times New Roman"/>
         </w:rPr>
-        <w:t xml:space="preserve"> don't build a second AI platform. Foundry, Entra, Agent 365, Purview and Azure API Management supply the platform; AAF's IP is the factory experience, templates, policy orchestration, catalog, approval model, deployment patterns and operating model.</w:t>
+        <w:t xml:space="preserve"> don't build a second AI platform. Foundry, Entra, Agent 365, Purview and Azure API Management supply the platform; AAF's IP is the factory experience, templates, policy orchestration, </w:t>
+      </w:r>
+      <w:proofErr w:type="spellStart"/>
+      <w:r>
+        <w:rPr>
+          <w:rFonts w:ascii="Times New Roman" w:hAnsi="Times New Roman" w:cs="Times New Roman"/>
+        </w:rPr>
+        <w:t>catalog</w:t>
+      </w:r>
+      <w:proofErr w:type="spellEnd"/>
+      <w:r>
+        <w:rPr>
+          <w:rFonts w:ascii="Times New Roman" w:hAnsi="Times New Roman" w:cs="Times New Roman"/>
+        </w:rPr>
+        <w:t>, approval model, deployment patterns and operating model.</w:t>
       </w:r>
     </w:p>
     <w:p>
@@ -3557,7 +3786,21 @@
         <w:rPr>
           <w:rFonts w:ascii="Times New Roman" w:hAnsi="Times New Roman" w:cs="Times New Roman"/>
         </w:rPr>
-        <w:t>Approved tool catalog, 5–10 tools</w:t>
+        <w:t xml:space="preserve">Approved tool </w:t>
+      </w:r>
+      <w:proofErr w:type="spellStart"/>
+      <w:r>
+        <w:rPr>
+          <w:rFonts w:ascii="Times New Roman" w:hAnsi="Times New Roman" w:cs="Times New Roman"/>
+        </w:rPr>
+        <w:t>catalog</w:t>
+      </w:r>
+      <w:proofErr w:type="spellEnd"/>
+      <w:r>
+        <w:rPr>
+          <w:rFonts w:ascii="Times New Roman" w:hAnsi="Times New Roman" w:cs="Times New Roman"/>
+        </w:rPr>
+        <w:t>, 5–10 tools</w:t>
       </w:r>
     </w:p>
     <w:p>
@@ -3823,7 +4066,21 @@
         <w:rPr>
           <w:rFonts w:ascii="Times New Roman" w:hAnsi="Times New Roman" w:cs="Times New Roman"/>
         </w:rPr>
-        <w:t>Define the Agent Blueprint JSON schema, build the prompt + structured-output call constrained by templates/catalogs so it can't invent connectors or permissions.</w:t>
+        <w:t>Define the Agent Blueprint JSON schema, build the prompt + structured-output call constrained by templates/</w:t>
+      </w:r>
+      <w:proofErr w:type="spellStart"/>
+      <w:r>
+        <w:rPr>
+          <w:rFonts w:ascii="Times New Roman" w:hAnsi="Times New Roman" w:cs="Times New Roman"/>
+        </w:rPr>
+        <w:t>catalogs</w:t>
+      </w:r>
+      <w:proofErr w:type="spellEnd"/>
+      <w:r>
+        <w:rPr>
+          <w:rFonts w:ascii="Times New Roman" w:hAnsi="Times New Roman" w:cs="Times New Roman"/>
+        </w:rPr>
+        <w:t xml:space="preserve"> so it can't invent connectors or permissions.</w:t>
       </w:r>
     </w:p>
     <w:p>
@@ -3840,8 +4097,18 @@
           <w:b/>
           <w:bCs/>
         </w:rPr>
-        <w:t>Phase 3 — Policy engine &amp; catalogs</w:t>
-      </w:r>
+        <w:t xml:space="preserve">Phase 3 — Policy engine &amp; </w:t>
+      </w:r>
+      <w:proofErr w:type="spellStart"/>
+      <w:r>
+        <w:rPr>
+          <w:rFonts w:ascii="Times New Roman" w:hAnsi="Times New Roman" w:cs="Times New Roman"/>
+          <w:b/>
+          <w:bCs/>
+        </w:rPr>
+        <w:t>catalogs</w:t>
+      </w:r>
+      <w:proofErr w:type="spellEnd"/>
     </w:p>
     <w:p>
       <w:pPr>
@@ -3866,7 +4133,35 @@
         <w:rPr>
           <w:rFonts w:ascii="Times New Roman" w:hAnsi="Times New Roman" w:cs="Times New Roman"/>
         </w:rPr>
-        <w:t>Implement the 14-point governance checklist against small catalogs of approved sources/tools; Azure API Center as the tool inventory.</w:t>
+        <w:t xml:space="preserve">Implement the 14-point governance checklist against small </w:t>
+      </w:r>
+      <w:proofErr w:type="spellStart"/>
+      <w:r>
+        <w:rPr>
+          <w:rFonts w:ascii="Times New Roman" w:hAnsi="Times New Roman" w:cs="Times New Roman"/>
+        </w:rPr>
+        <w:t>catalogs</w:t>
+      </w:r>
+      <w:proofErr w:type="spellEnd"/>
+      <w:r>
+        <w:rPr>
+          <w:rFonts w:ascii="Times New Roman" w:hAnsi="Times New Roman" w:cs="Times New Roman"/>
+        </w:rPr>
+        <w:t xml:space="preserve"> of approved sources/tools; Azure API </w:t>
+      </w:r>
+      <w:proofErr w:type="spellStart"/>
+      <w:r>
+        <w:rPr>
+          <w:rFonts w:ascii="Times New Roman" w:hAnsi="Times New Roman" w:cs="Times New Roman"/>
+        </w:rPr>
+        <w:t>Center</w:t>
+      </w:r>
+      <w:proofErr w:type="spellEnd"/>
+      <w:r>
+        <w:rPr>
+          <w:rFonts w:ascii="Times New Roman" w:hAnsi="Times New Roman" w:cs="Times New Roman"/>
+        </w:rPr>
+        <w:t xml:space="preserve"> as the tool inventory.</w:t>
       </w:r>
     </w:p>
     <w:p>
@@ -4413,8 +4708,16 @@
               <w:rPr>
                 <w:rFonts w:ascii="Times New Roman" w:hAnsi="Times New Roman" w:cs="Times New Roman"/>
               </w:rPr>
-              <w:t>3. Policy engine &amp; catalogs</w:t>
-            </w:r>
+              <w:t xml:space="preserve">3. Policy engine &amp; </w:t>
+            </w:r>
+            <w:proofErr w:type="spellStart"/>
+            <w:r>
+              <w:rPr>
+                <w:rFonts w:ascii="Times New Roman" w:hAnsi="Times New Roman" w:cs="Times New Roman"/>
+              </w:rPr>
+              <w:t>catalogs</w:t>
+            </w:r>
+            <w:proofErr w:type="spellEnd"/>
           </w:p>
         </w:tc>
         <w:tc>
@@ -4469,8 +4772,16 @@
               <w:rPr>
                 <w:rFonts w:ascii="Times New Roman" w:hAnsi="Times New Roman" w:cs="Times New Roman"/>
               </w:rPr>
-              <w:t>Blueprint auto-approved/rejected/flagged against a real catalog</w:t>
-            </w:r>
+              <w:t xml:space="preserve">Blueprint auto-approved/rejected/flagged against a real </w:t>
+            </w:r>
+            <w:proofErr w:type="spellStart"/>
+            <w:r>
+              <w:rPr>
+                <w:rFonts w:ascii="Times New Roman" w:hAnsi="Times New Roman" w:cs="Times New Roman"/>
+              </w:rPr>
+              <w:t>catalog</w:t>
+            </w:r>
+            <w:proofErr w:type="spellEnd"/>
           </w:p>
         </w:tc>
       </w:tr>
@@ -4833,7 +5144,21 @@
         <w:rPr>
           <w:rFonts w:ascii="Times New Roman" w:hAnsi="Times New Roman" w:cs="Times New Roman"/>
         </w:rPr>
-        <w:t>Highest slippage risk: Phase 2 (NLP reliability) and Phase 4 (Foundry API surface). Worth a small early spike on both rather than waiting for their scheduled phase.</w:t>
+        <w:t xml:space="preserve">Highest slippage risk: Phase 2 (NLP reliability) and Phase 4 (Foundry API surface). Worth a small early spike on </w:t>
+      </w:r>
+      <w:proofErr w:type="gramStart"/>
+      <w:r>
+        <w:rPr>
+          <w:rFonts w:ascii="Times New Roman" w:hAnsi="Times New Roman" w:cs="Times New Roman"/>
+        </w:rPr>
+        <w:t>both rather</w:t>
+      </w:r>
+      <w:proofErr w:type="gramEnd"/>
+      <w:r>
+        <w:rPr>
+          <w:rFonts w:ascii="Times New Roman" w:hAnsi="Times New Roman" w:cs="Times New Roman"/>
+        </w:rPr>
+        <w:t xml:space="preserve"> than waiting for their scheduled phase.</w:t>
       </w:r>
     </w:p>
     <w:p>
@@ -5275,11 +5600,19 @@
                 <w:rFonts w:ascii="Times New Roman" w:hAnsi="Times New Roman" w:cs="Times New Roman"/>
               </w:rPr>
             </w:pPr>
-            <w:r>
-              <w:rPr>
-                <w:rFonts w:ascii="Times New Roman" w:hAnsi="Times New Roman" w:cs="Times New Roman"/>
-              </w:rPr>
-              <w:t>Pydantic (Python)</w:t>
+            <w:proofErr w:type="spellStart"/>
+            <w:r>
+              <w:rPr>
+                <w:rFonts w:ascii="Times New Roman" w:hAnsi="Times New Roman" w:cs="Times New Roman"/>
+              </w:rPr>
+              <w:t>Pydantic</w:t>
+            </w:r>
+            <w:proofErr w:type="spellEnd"/>
+            <w:r>
+              <w:rPr>
+                <w:rFonts w:ascii="Times New Roman" w:hAnsi="Times New Roman" w:cs="Times New Roman"/>
+              </w:rPr>
+              <w:t xml:space="preserve"> (Python)</w:t>
             </w:r>
           </w:p>
         </w:tc>
@@ -5367,6 +5700,12 @@
               </w:rPr>
               <w:t>Hand-rolled rules module first; Azure Policy later</w:t>
             </w:r>
+            <w:r>
+              <w:rPr>
+                <w:rFonts w:ascii="Times New Roman" w:hAnsi="Times New Roman" w:cs="Times New Roman"/>
+              </w:rPr>
+              <w:t xml:space="preserve"> + Purview</w:t>
+            </w:r>
           </w:p>
         </w:tc>
         <w:tc>
@@ -5509,35 +5848,57 @@
               <w:rPr>
                 <w:rFonts w:ascii="Times New Roman" w:hAnsi="Times New Roman" w:cs="Times New Roman"/>
               </w:rPr>
-              <w:t>Tool catalog</w:t>
-            </w:r>
-          </w:p>
-        </w:tc>
-        <w:tc>
-          <w:tcPr>
-            <w:tcW w:w="0" w:type="auto"/>
-            <w:tcBorders>
-              <w:bottom w:val="single" w:sz="4" w:space="0" w:color="444441"/>
-            </w:tcBorders>
-            <w:tcMar>
-              <w:top w:w="135" w:type="dxa"/>
-              <w:left w:w="150" w:type="dxa"/>
-              <w:bottom w:w="135" w:type="dxa"/>
-              <w:right w:w="150" w:type="dxa"/>
-            </w:tcMar>
-            <w:hideMark/>
-          </w:tcPr>
-          <w:p>
-            <w:pPr>
-              <w:rPr>
-                <w:rFonts w:ascii="Times New Roman" w:hAnsi="Times New Roman" w:cs="Times New Roman"/>
-              </w:rPr>
-            </w:pPr>
-            <w:r>
-              <w:rPr>
-                <w:rFonts w:ascii="Times New Roman" w:hAnsi="Times New Roman" w:cs="Times New Roman"/>
-              </w:rPr>
-              <w:t>Azure API Center (Free plan)</w:t>
+              <w:t xml:space="preserve">Tool </w:t>
+            </w:r>
+            <w:proofErr w:type="spellStart"/>
+            <w:r>
+              <w:rPr>
+                <w:rFonts w:ascii="Times New Roman" w:hAnsi="Times New Roman" w:cs="Times New Roman"/>
+              </w:rPr>
+              <w:t>catalog</w:t>
+            </w:r>
+            <w:proofErr w:type="spellEnd"/>
+          </w:p>
+        </w:tc>
+        <w:tc>
+          <w:tcPr>
+            <w:tcW w:w="0" w:type="auto"/>
+            <w:tcBorders>
+              <w:bottom w:val="single" w:sz="4" w:space="0" w:color="444441"/>
+            </w:tcBorders>
+            <w:tcMar>
+              <w:top w:w="135" w:type="dxa"/>
+              <w:left w:w="150" w:type="dxa"/>
+              <w:bottom w:w="135" w:type="dxa"/>
+              <w:right w:w="150" w:type="dxa"/>
+            </w:tcMar>
+            <w:hideMark/>
+          </w:tcPr>
+          <w:p>
+            <w:pPr>
+              <w:rPr>
+                <w:rFonts w:ascii="Times New Roman" w:hAnsi="Times New Roman" w:cs="Times New Roman"/>
+              </w:rPr>
+            </w:pPr>
+            <w:r>
+              <w:rPr>
+                <w:rFonts w:ascii="Times New Roman" w:hAnsi="Times New Roman" w:cs="Times New Roman"/>
+              </w:rPr>
+              <w:t xml:space="preserve">Azure API </w:t>
+            </w:r>
+            <w:proofErr w:type="spellStart"/>
+            <w:r>
+              <w:rPr>
+                <w:rFonts w:ascii="Times New Roman" w:hAnsi="Times New Roman" w:cs="Times New Roman"/>
+              </w:rPr>
+              <w:t>Center</w:t>
+            </w:r>
+            <w:proofErr w:type="spellEnd"/>
+            <w:r>
+              <w:rPr>
+                <w:rFonts w:ascii="Times New Roman" w:hAnsi="Times New Roman" w:cs="Times New Roman"/>
+              </w:rPr>
+              <w:t xml:space="preserve"> (Free plan)</w:t>
             </w:r>
           </w:p>
         </w:tc>
@@ -6167,7 +6528,21 @@
               <w:rPr>
                 <w:rFonts w:ascii="Times New Roman" w:hAnsi="Times New Roman" w:cs="Times New Roman"/>
               </w:rPr>
-              <w:t>Real line item (~$15/user/mo standalone); bring in once past solo-dev MVP</w:t>
+              <w:t>Real line item (~$15/user/</w:t>
+            </w:r>
+            <w:proofErr w:type="spellStart"/>
+            <w:r>
+              <w:rPr>
+                <w:rFonts w:ascii="Times New Roman" w:hAnsi="Times New Roman" w:cs="Times New Roman"/>
+              </w:rPr>
+              <w:t>mo</w:t>
+            </w:r>
+            <w:proofErr w:type="spellEnd"/>
+            <w:r>
+              <w:rPr>
+                <w:rFonts w:ascii="Times New Roman" w:hAnsi="Times New Roman" w:cs="Times New Roman"/>
+              </w:rPr>
+              <w:t xml:space="preserve"> standalone); bring in once past solo-dev MVP</w:t>
             </w:r>
           </w:p>
         </w:tc>
@@ -6181,56 +6556,192 @@
           <w:bCs/>
         </w:rPr>
       </w:pPr>
-      <w:r>
+    </w:p>
+    <w:p>
+      <w:pPr>
         <w:rPr>
           <w:rFonts w:ascii="Times New Roman" w:hAnsi="Times New Roman" w:cs="Times New Roman"/>
           <w:b/>
           <w:bCs/>
         </w:rPr>
-        <w:t>13. Microsoft service notes (researched)</w:t>
-      </w:r>
-    </w:p>
-    <w:p>
-      <w:pPr>
+      </w:pPr>
+      <w:r>
         <w:rPr>
           <w:rFonts w:ascii="Times New Roman" w:hAnsi="Times New Roman" w:cs="Times New Roman"/>
           <w:b/>
           <w:bCs/>
         </w:rPr>
-      </w:pPr>
+        <w:t xml:space="preserve">13. </w:t>
+      </w:r>
       <w:r>
         <w:rPr>
           <w:rFonts w:ascii="Times New Roman" w:hAnsi="Times New Roman" w:cs="Times New Roman"/>
           <w:b/>
           <w:bCs/>
         </w:rPr>
-        <w:t>Foundry Agent Service GA</w:t>
-      </w:r>
-    </w:p>
-    <w:p>
-      <w:pPr>
-        <w:rPr>
-          <w:rFonts w:ascii="Times New Roman" w:hAnsi="Times New Roman" w:cs="Times New Roman"/>
-        </w:rPr>
-      </w:pPr>
-      <w:r>
-        <w:rPr>
-          <w:rFonts w:ascii="Times New Roman" w:hAnsi="Times New Roman" w:cs="Times New Roman"/>
-        </w:rPr>
-        <w:t>Core AI/agent runtime</w:t>
-      </w:r>
-    </w:p>
-    <w:p>
-      <w:pPr>
-        <w:rPr>
-          <w:rFonts w:ascii="Times New Roman" w:hAnsi="Times New Roman" w:cs="Times New Roman"/>
-        </w:rPr>
-      </w:pPr>
-      <w:r>
-        <w:rPr>
-          <w:rFonts w:ascii="Times New Roman" w:hAnsi="Times New Roman" w:cs="Times New Roman"/>
-        </w:rPr>
-        <w:t>Reached general availability in March 2026 with end-to-end private networking, Voice Live integration, expanded MCP authentication, GA evaluations with continuous monitoring, and hosted agent deployments across six new Azure regions. In June 2026, Claude became GA inside Foundry (Messages API, prompt caching, extended thinking, tool streaming), and Foundry agents gained GA publishing straight into Microsoft 365 Copilot and Teams — so the "Teams as first channel" MVP goal is now a governed first-party pipeline rather than a custom integration.</w:t>
+        <w:t>Foundry Architecture Pattern</w:t>
+      </w:r>
+    </w:p>
+    <w:p>
+      <w:r>
+        <w:t>Recommended customer deployment: one governed Foundry resource with separate projects or logical boundaries by business domain, environment and risk. Use separate development/test/production boundaries. Citizen builders should not receive broad subscription-level permissions.</w:t>
+      </w:r>
+    </w:p>
+    <w:p>
+      <w:pPr>
+        <w:pStyle w:val="ListNumber"/>
+        <w:tabs>
+          <w:tab w:val="num" w:pos="360"/>
+        </w:tabs>
+        <w:ind w:left="360" w:hanging="360"/>
+      </w:pPr>
+      <w:r>
+        <w:t>Factory UI authenticates through Entra ID.</w:t>
+      </w:r>
+    </w:p>
+    <w:p>
+      <w:pPr>
+        <w:pStyle w:val="ListNumber"/>
+        <w:tabs>
+          <w:tab w:val="num" w:pos="360"/>
+        </w:tabs>
+        <w:ind w:left="360" w:hanging="360"/>
+      </w:pPr>
+      <w:r>
+        <w:t>Factory backend uses managed identity/service principals to call the approved Foundry APIs.</w:t>
+      </w:r>
+    </w:p>
+    <w:p>
+      <w:pPr>
+        <w:pStyle w:val="ListNumber"/>
+        <w:tabs>
+          <w:tab w:val="num" w:pos="360"/>
+        </w:tabs>
+        <w:ind w:left="360" w:hanging="360"/>
+      </w:pPr>
+      <w:r>
+        <w:lastRenderedPageBreak/>
+        <w:t>User permissions determine which templates, data sources and tools appear in the UI.</w:t>
+      </w:r>
+    </w:p>
+    <w:p>
+      <w:pPr>
+        <w:pStyle w:val="ListNumber"/>
+        <w:tabs>
+          <w:tab w:val="num" w:pos="360"/>
+        </w:tabs>
+        <w:ind w:left="360" w:hanging="360"/>
+      </w:pPr>
+      <w:r>
+        <w:t>The backend generates a constrained Agent Blueprint.</w:t>
+      </w:r>
+    </w:p>
+    <w:p>
+      <w:pPr>
+        <w:pStyle w:val="ListNumber"/>
+        <w:tabs>
+          <w:tab w:val="num" w:pos="360"/>
+        </w:tabs>
+        <w:ind w:left="360" w:hanging="360"/>
+      </w:pPr>
+      <w:r>
+        <w:t>Policy engine validates the blueprint.</w:t>
+      </w:r>
+    </w:p>
+    <w:p>
+      <w:pPr>
+        <w:pStyle w:val="ListNumber"/>
+        <w:tabs>
+          <w:tab w:val="num" w:pos="360"/>
+        </w:tabs>
+        <w:ind w:left="360" w:hanging="360"/>
+      </w:pPr>
+      <w:r>
+        <w:t>Only approved components are translated into Foundry agent configuration.</w:t>
+      </w:r>
+    </w:p>
+    <w:p>
+      <w:pPr>
+        <w:pStyle w:val="ListNumber"/>
+        <w:tabs>
+          <w:tab w:val="num" w:pos="360"/>
+        </w:tabs>
+        <w:ind w:left="360" w:hanging="360"/>
+      </w:pPr>
+      <w:r>
+        <w:t>Agent is created as a development/test version.</w:t>
+      </w:r>
+    </w:p>
+    <w:p>
+      <w:pPr>
+        <w:pStyle w:val="ListNumber"/>
+        <w:tabs>
+          <w:tab w:val="num" w:pos="360"/>
+        </w:tabs>
+        <w:ind w:left="360" w:hanging="360"/>
+      </w:pPr>
+      <w:r>
+        <w:t>Evaluation and security checks execute.</w:t>
+      </w:r>
+    </w:p>
+    <w:p>
+      <w:pPr>
+        <w:pStyle w:val="ListNumber"/>
+        <w:tabs>
+          <w:tab w:val="num" w:pos="360"/>
+        </w:tabs>
+        <w:ind w:left="360" w:hanging="360"/>
+      </w:pPr>
+      <w:r>
+        <w:t>Approval workflow records business and technical approvals.</w:t>
+      </w:r>
+    </w:p>
+    <w:p>
+      <w:pPr>
+        <w:pStyle w:val="ListNumber"/>
+        <w:tabs>
+          <w:tab w:val="num" w:pos="360"/>
+        </w:tabs>
+        <w:ind w:left="360" w:hanging="360"/>
+      </w:pPr>
+      <w:r>
+        <w:t>Approved version is published/deployed.</w:t>
+      </w:r>
+    </w:p>
+    <w:p>
+      <w:pPr>
+        <w:pStyle w:val="ListNumber"/>
+        <w:tabs>
+          <w:tab w:val="num" w:pos="360"/>
+        </w:tabs>
+        <w:ind w:left="360" w:hanging="360"/>
+      </w:pPr>
+      <w:r>
+        <w:t>Agent is registered and governed through the Microsoft 365/Agent 365 ecosystem where applicable.</w:t>
+      </w:r>
+    </w:p>
+    <w:p>
+      <w:pPr>
+        <w:pStyle w:val="ListNumber"/>
+        <w:tabs>
+          <w:tab w:val="num" w:pos="360"/>
+        </w:tabs>
+        <w:ind w:left="360" w:hanging="360"/>
+      </w:pPr>
+      <w:r>
+        <w:t>Runtime telemetry flows to Foundry observability/Azure Monitor/SIEM.</w:t>
+      </w:r>
+    </w:p>
+    <w:p>
+      <w:pPr>
+        <w:pStyle w:val="ListNumber"/>
+        <w:tabs>
+          <w:tab w:val="num" w:pos="360"/>
+        </w:tabs>
+        <w:ind w:left="360" w:hanging="360"/>
+      </w:pPr>
+      <w:r>
+        <w:t>Changes create new agent versions rather than silently modifying production.</w:t>
       </w:r>
     </w:p>
     <w:p>
@@ -6247,121 +6758,54 @@
           <w:b/>
           <w:bCs/>
         </w:rPr>
-        <w:lastRenderedPageBreak/>
-        <w:t>Agent 365 GA — paid</w:t>
-      </w:r>
-    </w:p>
-    <w:p>
-      <w:pPr>
-        <w:rPr>
-          <w:rFonts w:ascii="Times New Roman" w:hAnsi="Times New Roman" w:cs="Times New Roman"/>
-        </w:rPr>
-      </w:pPr>
-      <w:r>
-        <w:rPr>
-          <w:rFonts w:ascii="Times New Roman" w:hAnsi="Times New Roman" w:cs="Times New Roman"/>
-        </w:rPr>
-        <w:t>Tenant-wide agent governance / registry</w:t>
-      </w:r>
-    </w:p>
-    <w:p>
-      <w:pPr>
-        <w:rPr>
-          <w:rFonts w:ascii="Times New Roman" w:hAnsi="Times New Roman" w:cs="Times New Roman"/>
-        </w:rPr>
-      </w:pPr>
-      <w:r>
-        <w:rPr>
-          <w:rFonts w:ascii="Times New Roman" w:hAnsi="Times New Roman" w:cs="Times New Roman"/>
-        </w:rPr>
-        <w:t>GA since May 1, 2026. Standalone pricing is $15/user/month, or bundled into Microsoft 365 E7 at $99/user/month. At GA, admins can install, publish, block, unblock, delete, and assign new owners for agents directly from the registry; it also assigns each agent its own Entra ID. This is a real budget line, not a free dev tool — worth bringing in once governance needs to be tenant-wide rather than during solo MVP development.</w:t>
-      </w:r>
-    </w:p>
-    <w:p>
-      <w:pPr>
+        <w:t>1</w:t>
+      </w:r>
+      <w:r>
         <w:rPr>
           <w:rFonts w:ascii="Times New Roman" w:hAnsi="Times New Roman" w:cs="Times New Roman"/>
           <w:b/>
           <w:bCs/>
         </w:rPr>
-      </w:pPr>
+        <w:t>4</w:t>
+      </w:r>
       <w:r>
         <w:rPr>
           <w:rFonts w:ascii="Times New Roman" w:hAnsi="Times New Roman" w:cs="Times New Roman"/>
           <w:b/>
           <w:bCs/>
         </w:rPr>
-        <w:t>Azure API Center Free plan available</w:t>
-      </w:r>
-    </w:p>
-    <w:p>
-      <w:pPr>
-        <w:rPr>
-          <w:rFonts w:ascii="Times New Roman" w:hAnsi="Times New Roman" w:cs="Times New Roman"/>
-        </w:rPr>
-      </w:pPr>
-      <w:r>
-        <w:rPr>
-          <w:rFonts w:ascii="Times New Roman" w:hAnsi="Times New Roman" w:cs="Times New Roman"/>
-        </w:rPr>
-        <w:t>Tool/API catalog</w:t>
-      </w:r>
-    </w:p>
-    <w:p>
-      <w:pPr>
-        <w:rPr>
-          <w:rFonts w:ascii="Times New Roman" w:hAnsi="Times New Roman" w:cs="Times New Roman"/>
-        </w:rPr>
-      </w:pPr>
-      <w:r>
-        <w:rPr>
-          <w:rFonts w:ascii="Times New Roman" w:hAnsi="Times New Roman" w:cs="Times New Roman"/>
-        </w:rPr>
-        <w:t>Design-time API governance and centralized discovery — exactly the "tool catalog" layer the architecture needs. Has a genuine Free plan (no Microsoft support on that tier, but functionally enough for a 5–10 tool MVP catalog). Distinct from Azure API Management, which is the runtime gateway.</w:t>
-      </w:r>
-    </w:p>
-    <w:p>
-      <w:pPr>
+        <w:t xml:space="preserve">. </w:t>
+      </w:r>
+      <w:r>
         <w:rPr>
           <w:rFonts w:ascii="Times New Roman" w:hAnsi="Times New Roman" w:cs="Times New Roman"/>
           <w:b/>
           <w:bCs/>
         </w:rPr>
-      </w:pPr>
-      <w:r>
+        <w:t>Example Customer Journey</w:t>
+      </w:r>
+    </w:p>
+    <w:p>
+      <w:pPr>
+        <w:rPr>
+          <w:rFonts w:ascii="Times New Roman" w:hAnsi="Times New Roman" w:cs="Times New Roman"/>
+        </w:rPr>
+      </w:pPr>
+      <w:r>
+        <w:rPr>
+          <w:rFonts w:ascii="Times New Roman" w:hAnsi="Times New Roman" w:cs="Times New Roman"/>
+        </w:rPr>
+        <w:t>A Finance Manager enters: 'I want an agent that reviews supplier invoices against our procurement policy and flags exceptions.' The Factory identifies Finance + document analysis + approved procurement knowledge. The user selects the procurement SharePoint library and an approved invoice-processing API. The policy engine sees that the agent is read-only and internal, assigns a low/medium risk class, creates the test agent in Foundry, runs evaluation cases, and submits it for the configured approval route. Once approved, the agent is published to the selected audience. The Finance Manager can later update the agent through a new version without requiring CREDO to rebuild it from scratch.</w:t>
+      </w:r>
+    </w:p>
+    <w:p>
+      <w:pPr>
         <w:rPr>
           <w:rFonts w:ascii="Times New Roman" w:hAnsi="Times New Roman" w:cs="Times New Roman"/>
           <w:b/>
           <w:bCs/>
         </w:rPr>
-        <w:t>Azure Functions &amp; Azure API Management</w:t>
-      </w:r>
-    </w:p>
-    <w:p>
-      <w:pPr>
-        <w:rPr>
-          <w:rFonts w:ascii="Times New Roman" w:hAnsi="Times New Roman" w:cs="Times New Roman"/>
-        </w:rPr>
-      </w:pPr>
-      <w:r>
-        <w:rPr>
-          <w:rFonts w:ascii="Times New Roman" w:hAnsi="Times New Roman" w:cs="Times New Roman"/>
-        </w:rPr>
-        <w:t>Orchestration layer</w:t>
-      </w:r>
-    </w:p>
-    <w:p>
-      <w:pPr>
-        <w:rPr>
-          <w:rFonts w:ascii="Times New Roman" w:hAnsi="Times New Roman" w:cs="Times New Roman"/>
-        </w:rPr>
-      </w:pPr>
-      <w:r>
-        <w:rPr>
-          <w:rFonts w:ascii="Times New Roman" w:hAnsi="Times New Roman" w:cs="Times New Roman"/>
-        </w:rPr>
-        <w:t>Functions (Consumption plan has a free monthly grant) hosts the blueprint-assembly and policy-check logic. APIM fronts it as a governed gateway; its Consumption tier is usage-based and cheap at MVP scale — don't reach for the Developer/Standard tiers until you need policies like rate limiting or OAuth validation at the gateway itself.</w:t>
-      </w:r>
+      </w:pPr>
     </w:p>
     <w:p>
       <w:pPr>
@@ -6377,1303 +6821,44 @@
           <w:b/>
           <w:bCs/>
         </w:rPr>
-        <w:t>Microsoft Entra ID</w:t>
-      </w:r>
-    </w:p>
-    <w:p>
-      <w:pPr>
-        <w:rPr>
-          <w:rFonts w:ascii="Times New Roman" w:hAnsi="Times New Roman" w:cs="Times New Roman"/>
-        </w:rPr>
-      </w:pPr>
-      <w:r>
-        <w:rPr>
-          <w:rFonts w:ascii="Times New Roman" w:hAnsi="Times New Roman" w:cs="Times New Roman"/>
-        </w:rPr>
-        <w:t>Identity backbone</w:t>
-      </w:r>
-    </w:p>
-    <w:p>
-      <w:pPr>
-        <w:rPr>
-          <w:rFonts w:ascii="Times New Roman" w:hAnsi="Times New Roman" w:cs="Times New Roman"/>
-        </w:rPr>
-      </w:pPr>
-      <w:r>
-        <w:rPr>
-          <w:rFonts w:ascii="Times New Roman" w:hAnsi="Times New Roman" w:cs="Times New Roman"/>
-        </w:rPr>
-        <w:t>Handles SSO, groups, RBAC, Conditional Access, and both user and agent identity (Agent 365 assigns each agent an Entra ID). Free tier (Entra ID Free) covers basic app registration and group-based access for MVP; Conditional Access policies require P1/P2 licensing — relevant once the customer tenant needs them, not for your own dev tenant.</w:t>
-      </w:r>
-    </w:p>
-    <w:p>
-      <w:pPr>
+        <w:t xml:space="preserve">15. </w:t>
+      </w:r>
+      <w:r>
         <w:rPr>
           <w:rFonts w:ascii="Times New Roman" w:hAnsi="Times New Roman" w:cs="Times New Roman"/>
           <w:b/>
           <w:bCs/>
         </w:rPr>
-      </w:pPr>
-      <w:r>
+        <w:t>Important Architecture Decision</w:t>
+      </w:r>
+    </w:p>
+    <w:p>
+      <w:pPr>
         <w:rPr>
           <w:rFonts w:ascii="Times New Roman" w:hAnsi="Times New Roman" w:cs="Times New Roman"/>
           <w:b/>
           <w:bCs/>
         </w:rPr>
-        <w:t>Microsoft Purview</w:t>
-      </w:r>
-    </w:p>
-    <w:p>
-      <w:pPr>
-        <w:rPr>
-          <w:rFonts w:ascii="Times New Roman" w:hAnsi="Times New Roman" w:cs="Times New Roman"/>
-        </w:rPr>
-      </w:pPr>
-      <w:r>
-        <w:rPr>
-          <w:rFonts w:ascii="Times New Roman" w:hAnsi="Times New Roman" w:cs="Times New Roman"/>
-        </w:rPr>
-        <w:t>Data governance, DLP, sensitivity labels</w:t>
-      </w:r>
-    </w:p>
-    <w:p>
-      <w:pPr>
-        <w:rPr>
-          <w:rFonts w:ascii="Times New Roman" w:hAnsi="Times New Roman" w:cs="Times New Roman"/>
-        </w:rPr>
-      </w:pPr>
-      <w:r>
-        <w:rPr>
-          <w:rFonts w:ascii="Times New Roman" w:hAnsi="Times New Roman" w:cs="Times New Roman"/>
-        </w:rPr>
-        <w:t>Supplies data classification and DLP enforcement the policy engine checks against (the "could this agent access personal/financial/health data" gate). Purview's AI-specific governance features (for Copilot/agent data flows) have been evolving quickly through 2025–2026 — worth a fresh docs check closer to Phase 3/6 rather than relying on older material.</w:t>
-      </w:r>
-    </w:p>
-    <w:p>
-      <w:pPr>
-        <w:rPr>
-          <w:rFonts w:ascii="Times New Roman" w:hAnsi="Times New Roman" w:cs="Times New Roman"/>
-          <w:b/>
-          <w:bCs/>
-        </w:rPr>
-      </w:pPr>
-      <w:r>
-        <w:rPr>
-          <w:rFonts w:ascii="Times New Roman" w:hAnsi="Times New Roman" w:cs="Times New Roman"/>
-          <w:b/>
-          <w:bCs/>
-        </w:rPr>
-        <w:t>Azure Key Vault</w:t>
-      </w:r>
-    </w:p>
-    <w:p>
-      <w:pPr>
-        <w:rPr>
-          <w:rFonts w:ascii="Times New Roman" w:hAnsi="Times New Roman" w:cs="Times New Roman"/>
-        </w:rPr>
-      </w:pPr>
-      <w:r>
-        <w:rPr>
-          <w:rFonts w:ascii="Times New Roman" w:hAnsi="Times New Roman" w:cs="Times New Roman"/>
-        </w:rPr>
-        <w:t>Secrets &amp; certificates</w:t>
-      </w:r>
-    </w:p>
-    <w:p>
-      <w:pPr>
-        <w:rPr>
-          <w:rFonts w:ascii="Times New Roman" w:hAnsi="Times New Roman" w:cs="Times New Roman"/>
-        </w:rPr>
-      </w:pPr>
-      <w:r>
-        <w:rPr>
-          <w:rFonts w:ascii="Times New Roman" w:hAnsi="Times New Roman" w:cs="Times New Roman"/>
-        </w:rPr>
-        <w:t>Standard tier has a generous free-tier-equivalent pricing model (pay per operation, trivial at dev scale). Prefer Managed Identities over stored secrets wherever Functions/APIM talk to Foundry or other Azure services — avoids needing Key Vault for most internal service-to-service auth.</w:t>
-      </w:r>
-    </w:p>
-    <w:p>
-      <w:pPr>
-        <w:rPr>
-          <w:rFonts w:ascii="Times New Roman" w:hAnsi="Times New Roman" w:cs="Times New Roman"/>
-          <w:b/>
-          <w:bCs/>
-        </w:rPr>
-      </w:pPr>
-      <w:r>
-        <w:rPr>
-          <w:rFonts w:ascii="Times New Roman" w:hAnsi="Times New Roman" w:cs="Times New Roman"/>
-          <w:b/>
-          <w:bCs/>
-        </w:rPr>
-        <w:t>SharePoint / Microsoft Graph</w:t>
-      </w:r>
-    </w:p>
-    <w:p>
-      <w:pPr>
-        <w:rPr>
-          <w:rFonts w:ascii="Times New Roman" w:hAnsi="Times New Roman" w:cs="Times New Roman"/>
-        </w:rPr>
-      </w:pPr>
-      <w:r>
-        <w:rPr>
-          <w:rFonts w:ascii="Times New Roman" w:hAnsi="Times New Roman" w:cs="Times New Roman"/>
-        </w:rPr>
-        <w:t>Knowledge source</w:t>
-      </w:r>
-    </w:p>
-    <w:p>
-      <w:pPr>
-        <w:rPr>
-          <w:rFonts w:ascii="Times New Roman" w:hAnsi="Times New Roman" w:cs="Times New Roman"/>
-        </w:rPr>
-      </w:pPr>
-      <w:r>
-        <w:rPr>
-          <w:rFonts w:ascii="Times New Roman" w:hAnsi="Times New Roman" w:cs="Times New Roman"/>
-        </w:rPr>
-        <w:lastRenderedPageBreak/>
-        <w:t>Primary enterprise knowledge source for Knowledge Assistant-type agents, accessed via Graph with permission scoping so agents only see what their audience is entitled to. Needs a real Microsoft 365 tenant (not just an Azure subscription) to test against meaningfully.</w:t>
-      </w:r>
-    </w:p>
-    <w:p>
-      <w:pPr>
-        <w:rPr>
-          <w:rFonts w:ascii="Times New Roman" w:hAnsi="Times New Roman" w:cs="Times New Roman"/>
-          <w:b/>
-          <w:bCs/>
-        </w:rPr>
-      </w:pPr>
-      <w:r>
-        <w:rPr>
-          <w:rFonts w:ascii="Times New Roman" w:hAnsi="Times New Roman" w:cs="Times New Roman"/>
-          <w:b/>
-          <w:bCs/>
-        </w:rPr>
-        <w:t>Microsoft Defender</w:t>
-      </w:r>
-    </w:p>
-    <w:p>
-      <w:pPr>
-        <w:rPr>
-          <w:rFonts w:ascii="Times New Roman" w:hAnsi="Times New Roman" w:cs="Times New Roman"/>
-        </w:rPr>
-      </w:pPr>
-      <w:r>
-        <w:rPr>
-          <w:rFonts w:ascii="Times New Roman" w:hAnsi="Times New Roman" w:cs="Times New Roman"/>
-        </w:rPr>
-        <w:t>Security monitoring</w:t>
-      </w:r>
-    </w:p>
-    <w:p>
-      <w:pPr>
-        <w:rPr>
-          <w:rFonts w:ascii="Times New Roman" w:hAnsi="Times New Roman" w:cs="Times New Roman"/>
-        </w:rPr>
-      </w:pPr>
-      <w:r>
-        <w:rPr>
-          <w:rFonts w:ascii="Times New Roman" w:hAnsi="Times New Roman" w:cs="Times New Roman"/>
-        </w:rPr>
-        <w:t>Covers runtime security signals — prompt injection, data exfiltration via tool calls, anomalous agent behavior — and integrates with Agent 365's "secure" pillar. Defender for AI / Defender for Cloud Apps coverage of agents is a fast-moving area; check current docs before Phase 6 rather than assuming older capability descriptions still hold.</w:t>
-      </w:r>
-    </w:p>
-    <w:p>
-      <w:pPr>
-        <w:rPr>
-          <w:rFonts w:ascii="Times New Roman" w:hAnsi="Times New Roman" w:cs="Times New Roman"/>
-          <w:b/>
-          <w:bCs/>
-        </w:rPr>
-      </w:pPr>
-      <w:r>
-        <w:rPr>
-          <w:rFonts w:ascii="Times New Roman" w:hAnsi="Times New Roman" w:cs="Times New Roman"/>
-          <w:b/>
-          <w:bCs/>
-        </w:rPr>
-        <w:t>Azure AI Search</w:t>
-      </w:r>
-    </w:p>
-    <w:p>
-      <w:pPr>
-        <w:rPr>
-          <w:rFonts w:ascii="Times New Roman" w:hAnsi="Times New Roman" w:cs="Times New Roman"/>
-        </w:rPr>
-      </w:pPr>
-      <w:r>
-        <w:rPr>
-          <w:rFonts w:ascii="Times New Roman" w:hAnsi="Times New Roman" w:cs="Times New Roman"/>
-        </w:rPr>
-        <w:t>Retrieval/grounding</w:t>
-      </w:r>
-    </w:p>
-    <w:p>
-      <w:pPr>
-        <w:rPr>
-          <w:rFonts w:ascii="Times New Roman" w:hAnsi="Times New Roman" w:cs="Times New Roman"/>
-        </w:rPr>
-      </w:pPr>
-      <w:r>
-        <w:rPr>
-          <w:rFonts w:ascii="Times New Roman" w:hAnsi="Times New Roman" w:cs="Times New Roman"/>
-        </w:rPr>
-        <w:t>Backs RAG-style grounding for Knowledge Assistant agents when raw SharePoint/Graph search isn't precise enough. Has a free tier (small index size, fine for MVP-scale testing) before needing Basic/Standard.</w:t>
-      </w:r>
-    </w:p>
-    <w:p>
-      <w:pPr>
-        <w:rPr>
-          <w:rFonts w:ascii="Times New Roman" w:hAnsi="Times New Roman" w:cs="Times New Roman"/>
-          <w:b/>
-          <w:bCs/>
-        </w:rPr>
-      </w:pPr>
-      <w:r>
-        <w:rPr>
-          <w:rFonts w:ascii="Times New Roman" w:hAnsi="Times New Roman" w:cs="Times New Roman"/>
-          <w:b/>
-          <w:bCs/>
-        </w:rPr>
-        <w:t>Application Insights / Azure Monitor</w:t>
-      </w:r>
-    </w:p>
-    <w:p>
-      <w:pPr>
-        <w:rPr>
-          <w:rFonts w:ascii="Times New Roman" w:hAnsi="Times New Roman" w:cs="Times New Roman"/>
-        </w:rPr>
-      </w:pPr>
-      <w:r>
-        <w:rPr>
-          <w:rFonts w:ascii="Times New Roman" w:hAnsi="Times New Roman" w:cs="Times New Roman"/>
-        </w:rPr>
-        <w:t>Observability</w:t>
-      </w:r>
-    </w:p>
-    <w:p>
-      <w:pPr>
-        <w:rPr>
-          <w:rFonts w:ascii="Times New Roman" w:hAnsi="Times New Roman" w:cs="Times New Roman"/>
-        </w:rPr>
-      </w:pPr>
-      <w:r>
-        <w:rPr>
-          <w:rFonts w:ascii="Times New Roman" w:hAnsi="Times New Roman" w:cs="Times New Roman"/>
-        </w:rPr>
-        <w:t>Captures Factory app telemetry (errors, latency, usage) separately from Foundry's own agent-level tracing/evaluation — the architecture needs both, piped into one dashboard for Phase 6. Has a free monthly data allowance generous enough for MVP telemetry volume.</w:t>
-      </w:r>
-    </w:p>
-    <w:p>
-      <w:pPr>
-        <w:rPr>
-          <w:rFonts w:ascii="Times New Roman" w:hAnsi="Times New Roman" w:cs="Times New Roman"/>
-          <w:b/>
-          <w:bCs/>
-        </w:rPr>
-      </w:pPr>
-      <w:r>
-        <w:rPr>
-          <w:rFonts w:ascii="Times New Roman" w:hAnsi="Times New Roman" w:cs="Times New Roman"/>
-          <w:b/>
-          <w:bCs/>
-        </w:rPr>
-        <w:t>Power Platform</w:t>
-      </w:r>
-    </w:p>
-    <w:p>
-      <w:pPr>
-        <w:rPr>
-          <w:rFonts w:ascii="Times New Roman" w:hAnsi="Times New Roman" w:cs="Times New Roman"/>
-        </w:rPr>
-      </w:pPr>
-      <w:r>
-        <w:rPr>
-          <w:rFonts w:ascii="Times New Roman" w:hAnsi="Times New Roman" w:cs="Times New Roman"/>
-        </w:rPr>
-        <w:t>Low-code workflow option</w:t>
-      </w:r>
-    </w:p>
-    <w:p>
-      <w:pPr>
-        <w:rPr>
-          <w:rFonts w:ascii="Times New Roman" w:hAnsi="Times New Roman" w:cs="Times New Roman"/>
-        </w:rPr>
-      </w:pPr>
-      <w:r>
-        <w:rPr>
-          <w:rFonts w:ascii="Times New Roman" w:hAnsi="Times New Roman" w:cs="Times New Roman"/>
-        </w:rPr>
-        <w:t>Optional: useful if a business workflow (e.g. the approval routing or a notification step) is better expressed as a Power Automate flow than custom code. Not core to the MVP — treat as a later convenience rather than a Phase 0–6 dependency.</w:t>
-      </w:r>
-    </w:p>
-    <w:p>
-      <w:pPr>
-        <w:rPr>
-          <w:rFonts w:ascii="Times New Roman" w:hAnsi="Times New Roman" w:cs="Times New Roman"/>
-          <w:b/>
-          <w:bCs/>
-        </w:rPr>
-      </w:pPr>
-      <w:r>
-        <w:rPr>
-          <w:rFonts w:ascii="Times New Roman" w:hAnsi="Times New Roman" w:cs="Times New Roman"/>
-          <w:b/>
-          <w:bCs/>
-        </w:rPr>
-        <w:t>14. Research checklist</w:t>
-      </w:r>
-    </w:p>
-    <w:p>
-      <w:pPr>
-        <w:rPr>
-          <w:rFonts w:ascii="Times New Roman" w:hAnsi="Times New Roman" w:cs="Times New Roman"/>
-        </w:rPr>
-      </w:pPr>
-      <w:r>
-        <w:rPr>
-          <w:rFonts w:ascii="Times New Roman" w:hAnsi="Times New Roman" w:cs="Times New Roman"/>
-        </w:rPr>
-        <w:t>Topics flagged for a closer look, with current status:</w:t>
-      </w:r>
-    </w:p>
-    <w:tbl>
-      <w:tblPr>
-        <w:tblW w:w="9634" w:type="dxa"/>
-        <w:tblCellMar>
-          <w:top w:w="15" w:type="dxa"/>
-          <w:left w:w="15" w:type="dxa"/>
-          <w:bottom w:w="15" w:type="dxa"/>
-          <w:right w:w="15" w:type="dxa"/>
-        </w:tblCellMar>
-        <w:tblLook w:val="04A0" w:firstRow="1" w:lastRow="0" w:firstColumn="1" w:lastColumn="0" w:noHBand="0" w:noVBand="1"/>
-      </w:tblPr>
-      <w:tblGrid>
-        <w:gridCol w:w="2144"/>
-        <w:gridCol w:w="7490"/>
-      </w:tblGrid>
-      <w:tr>
-        <w:tc>
-          <w:tcPr>
-            <w:tcW w:w="0" w:type="auto"/>
-            <w:tcBorders>
-              <w:bottom w:val="single" w:sz="4" w:space="0" w:color="444441"/>
-            </w:tcBorders>
-            <w:tcMar>
-              <w:top w:w="135" w:type="dxa"/>
-              <w:left w:w="150" w:type="dxa"/>
-              <w:bottom w:w="135" w:type="dxa"/>
-              <w:right w:w="150" w:type="dxa"/>
-            </w:tcMar>
-            <w:hideMark/>
-          </w:tcPr>
-          <w:p>
-            <w:pPr>
-              <w:rPr>
-                <w:rFonts w:ascii="Times New Roman" w:hAnsi="Times New Roman" w:cs="Times New Roman"/>
-                <w:b/>
-                <w:bCs/>
-              </w:rPr>
-            </w:pPr>
-            <w:r>
-              <w:rPr>
-                <w:rFonts w:ascii="Times New Roman" w:hAnsi="Times New Roman" w:cs="Times New Roman"/>
-                <w:b/>
-                <w:bCs/>
-              </w:rPr>
-              <w:t>Service</w:t>
-            </w:r>
-          </w:p>
-        </w:tc>
-        <w:tc>
-          <w:tcPr>
-            <w:tcW w:w="0" w:type="auto"/>
-            <w:tcBorders>
-              <w:bottom w:val="single" w:sz="4" w:space="0" w:color="444441"/>
-            </w:tcBorders>
-            <w:tcMar>
-              <w:top w:w="135" w:type="dxa"/>
-              <w:left w:w="150" w:type="dxa"/>
-              <w:bottom w:w="135" w:type="dxa"/>
-              <w:right w:w="150" w:type="dxa"/>
-            </w:tcMar>
-            <w:hideMark/>
-          </w:tcPr>
-          <w:p>
-            <w:pPr>
-              <w:rPr>
-                <w:rFonts w:ascii="Times New Roman" w:hAnsi="Times New Roman" w:cs="Times New Roman"/>
-                <w:b/>
-                <w:bCs/>
-              </w:rPr>
-            </w:pPr>
-            <w:r>
-              <w:rPr>
-                <w:rFonts w:ascii="Times New Roman" w:hAnsi="Times New Roman" w:cs="Times New Roman"/>
-                <w:b/>
-                <w:bCs/>
-              </w:rPr>
-              <w:t>Status</w:t>
-            </w:r>
-          </w:p>
-        </w:tc>
-      </w:tr>
-      <w:tr>
-        <w:tc>
-          <w:tcPr>
-            <w:tcW w:w="0" w:type="auto"/>
-            <w:tcBorders>
-              <w:bottom w:val="single" w:sz="4" w:space="0" w:color="444441"/>
-            </w:tcBorders>
-            <w:tcMar>
-              <w:top w:w="135" w:type="dxa"/>
-              <w:left w:w="150" w:type="dxa"/>
-              <w:bottom w:w="135" w:type="dxa"/>
-              <w:right w:w="150" w:type="dxa"/>
-            </w:tcMar>
-            <w:hideMark/>
-          </w:tcPr>
-          <w:p>
-            <w:pPr>
-              <w:rPr>
-                <w:rFonts w:ascii="Times New Roman" w:hAnsi="Times New Roman" w:cs="Times New Roman"/>
-              </w:rPr>
-            </w:pPr>
-            <w:r>
-              <w:rPr>
-                <w:rFonts w:ascii="Times New Roman" w:hAnsi="Times New Roman" w:cs="Times New Roman"/>
-              </w:rPr>
-              <w:t>Foundry Agent Service</w:t>
-            </w:r>
-          </w:p>
-        </w:tc>
-        <w:tc>
-          <w:tcPr>
-            <w:tcW w:w="0" w:type="auto"/>
-            <w:tcBorders>
-              <w:bottom w:val="single" w:sz="4" w:space="0" w:color="444441"/>
-            </w:tcBorders>
-            <w:tcMar>
-              <w:top w:w="135" w:type="dxa"/>
-              <w:left w:w="150" w:type="dxa"/>
-              <w:bottom w:w="135" w:type="dxa"/>
-              <w:right w:w="150" w:type="dxa"/>
-            </w:tcMar>
-            <w:hideMark/>
-          </w:tcPr>
-          <w:p>
-            <w:pPr>
-              <w:rPr>
-                <w:rFonts w:ascii="Times New Roman" w:hAnsi="Times New Roman" w:cs="Times New Roman"/>
-              </w:rPr>
-            </w:pPr>
-            <w:r>
-              <w:rPr>
-                <w:rFonts w:ascii="Times New Roman" w:hAnsi="Times New Roman" w:cs="Times New Roman"/>
-              </w:rPr>
-              <w:t>Verified current (GA, March 2026) — notes above</w:t>
-            </w:r>
-          </w:p>
-        </w:tc>
-      </w:tr>
-      <w:tr>
-        <w:tc>
-          <w:tcPr>
-            <w:tcW w:w="0" w:type="auto"/>
-            <w:tcBorders>
-              <w:bottom w:val="single" w:sz="4" w:space="0" w:color="444441"/>
-            </w:tcBorders>
-            <w:tcMar>
-              <w:top w:w="135" w:type="dxa"/>
-              <w:left w:w="150" w:type="dxa"/>
-              <w:bottom w:w="135" w:type="dxa"/>
-              <w:right w:w="150" w:type="dxa"/>
-            </w:tcMar>
-            <w:hideMark/>
-          </w:tcPr>
-          <w:p>
-            <w:pPr>
-              <w:rPr>
-                <w:rFonts w:ascii="Times New Roman" w:hAnsi="Times New Roman" w:cs="Times New Roman"/>
-              </w:rPr>
-            </w:pPr>
-            <w:r>
-              <w:rPr>
-                <w:rFonts w:ascii="Times New Roman" w:hAnsi="Times New Roman" w:cs="Times New Roman"/>
-              </w:rPr>
-              <w:t>Agent 365</w:t>
-            </w:r>
-          </w:p>
-        </w:tc>
-        <w:tc>
-          <w:tcPr>
-            <w:tcW w:w="0" w:type="auto"/>
-            <w:tcBorders>
-              <w:bottom w:val="single" w:sz="4" w:space="0" w:color="444441"/>
-            </w:tcBorders>
-            <w:tcMar>
-              <w:top w:w="135" w:type="dxa"/>
-              <w:left w:w="150" w:type="dxa"/>
-              <w:bottom w:w="135" w:type="dxa"/>
-              <w:right w:w="150" w:type="dxa"/>
-            </w:tcMar>
-            <w:hideMark/>
-          </w:tcPr>
-          <w:p>
-            <w:pPr>
-              <w:rPr>
-                <w:rFonts w:ascii="Times New Roman" w:hAnsi="Times New Roman" w:cs="Times New Roman"/>
-              </w:rPr>
-            </w:pPr>
-            <w:r>
-              <w:rPr>
-                <w:rFonts w:ascii="Times New Roman" w:hAnsi="Times New Roman" w:cs="Times New Roman"/>
-              </w:rPr>
-              <w:t>Verified current (GA, May 2026, pricing) — notes above</w:t>
-            </w:r>
-          </w:p>
-        </w:tc>
-      </w:tr>
-      <w:tr>
-        <w:tc>
-          <w:tcPr>
-            <w:tcW w:w="0" w:type="auto"/>
-            <w:tcBorders>
-              <w:bottom w:val="single" w:sz="4" w:space="0" w:color="444441"/>
-            </w:tcBorders>
-            <w:tcMar>
-              <w:top w:w="135" w:type="dxa"/>
-              <w:left w:w="150" w:type="dxa"/>
-              <w:bottom w:w="135" w:type="dxa"/>
-              <w:right w:w="150" w:type="dxa"/>
-            </w:tcMar>
-            <w:hideMark/>
-          </w:tcPr>
-          <w:p>
-            <w:pPr>
-              <w:rPr>
-                <w:rFonts w:ascii="Times New Roman" w:hAnsi="Times New Roman" w:cs="Times New Roman"/>
-              </w:rPr>
-            </w:pPr>
-            <w:r>
-              <w:rPr>
-                <w:rFonts w:ascii="Times New Roman" w:hAnsi="Times New Roman" w:cs="Times New Roman"/>
-              </w:rPr>
-              <w:t>Azure API Center</w:t>
-            </w:r>
-          </w:p>
-        </w:tc>
-        <w:tc>
-          <w:tcPr>
-            <w:tcW w:w="0" w:type="auto"/>
-            <w:tcBorders>
-              <w:bottom w:val="single" w:sz="4" w:space="0" w:color="444441"/>
-            </w:tcBorders>
-            <w:tcMar>
-              <w:top w:w="135" w:type="dxa"/>
-              <w:left w:w="150" w:type="dxa"/>
-              <w:bottom w:w="135" w:type="dxa"/>
-              <w:right w:w="150" w:type="dxa"/>
-            </w:tcMar>
-            <w:hideMark/>
-          </w:tcPr>
-          <w:p>
-            <w:pPr>
-              <w:rPr>
-                <w:rFonts w:ascii="Times New Roman" w:hAnsi="Times New Roman" w:cs="Times New Roman"/>
-              </w:rPr>
-            </w:pPr>
-            <w:r>
-              <w:rPr>
-                <w:rFonts w:ascii="Times New Roman" w:hAnsi="Times New Roman" w:cs="Times New Roman"/>
-              </w:rPr>
-              <w:t>Verified current (Free plan exists) — notes above</w:t>
-            </w:r>
-          </w:p>
-        </w:tc>
-      </w:tr>
-      <w:tr>
-        <w:tc>
-          <w:tcPr>
-            <w:tcW w:w="0" w:type="auto"/>
-            <w:tcBorders>
-              <w:bottom w:val="single" w:sz="4" w:space="0" w:color="444441"/>
-            </w:tcBorders>
-            <w:tcMar>
-              <w:top w:w="135" w:type="dxa"/>
-              <w:left w:w="150" w:type="dxa"/>
-              <w:bottom w:w="135" w:type="dxa"/>
-              <w:right w:w="150" w:type="dxa"/>
-            </w:tcMar>
-            <w:hideMark/>
-          </w:tcPr>
-          <w:p>
-            <w:pPr>
-              <w:rPr>
-                <w:rFonts w:ascii="Times New Roman" w:hAnsi="Times New Roman" w:cs="Times New Roman"/>
-              </w:rPr>
-            </w:pPr>
-            <w:r>
-              <w:rPr>
-                <w:rFonts w:ascii="Times New Roman" w:hAnsi="Times New Roman" w:cs="Times New Roman"/>
-              </w:rPr>
-              <w:t>Azure Functions</w:t>
-            </w:r>
-          </w:p>
-        </w:tc>
-        <w:tc>
-          <w:tcPr>
-            <w:tcW w:w="0" w:type="auto"/>
-            <w:tcBorders>
-              <w:bottom w:val="single" w:sz="4" w:space="0" w:color="444441"/>
-            </w:tcBorders>
-            <w:tcMar>
-              <w:top w:w="135" w:type="dxa"/>
-              <w:left w:w="150" w:type="dxa"/>
-              <w:bottom w:w="135" w:type="dxa"/>
-              <w:right w:w="150" w:type="dxa"/>
-            </w:tcMar>
-            <w:hideMark/>
-          </w:tcPr>
-          <w:p>
-            <w:pPr>
-              <w:rPr>
-                <w:rFonts w:ascii="Times New Roman" w:hAnsi="Times New Roman" w:cs="Times New Roman"/>
-              </w:rPr>
-            </w:pPr>
-            <w:r>
-              <w:rPr>
-                <w:rFonts w:ascii="Times New Roman" w:hAnsi="Times New Roman" w:cs="Times New Roman"/>
-              </w:rPr>
-              <w:t>Stable service, general knowledge applied — light check before Phase 0 pricing tiers</w:t>
-            </w:r>
-          </w:p>
-        </w:tc>
-      </w:tr>
-      <w:tr>
-        <w:tc>
-          <w:tcPr>
-            <w:tcW w:w="0" w:type="auto"/>
-            <w:tcBorders>
-              <w:bottom w:val="single" w:sz="4" w:space="0" w:color="444441"/>
-            </w:tcBorders>
-            <w:tcMar>
-              <w:top w:w="135" w:type="dxa"/>
-              <w:left w:w="150" w:type="dxa"/>
-              <w:bottom w:w="135" w:type="dxa"/>
-              <w:right w:w="150" w:type="dxa"/>
-            </w:tcMar>
-            <w:hideMark/>
-          </w:tcPr>
-          <w:p>
-            <w:pPr>
-              <w:rPr>
-                <w:rFonts w:ascii="Times New Roman" w:hAnsi="Times New Roman" w:cs="Times New Roman"/>
-              </w:rPr>
-            </w:pPr>
-            <w:r>
-              <w:rPr>
-                <w:rFonts w:ascii="Times New Roman" w:hAnsi="Times New Roman" w:cs="Times New Roman"/>
-              </w:rPr>
-              <w:lastRenderedPageBreak/>
-              <w:t>Azure API Management</w:t>
-            </w:r>
-          </w:p>
-        </w:tc>
-        <w:tc>
-          <w:tcPr>
-            <w:tcW w:w="0" w:type="auto"/>
-            <w:tcBorders>
-              <w:bottom w:val="single" w:sz="4" w:space="0" w:color="444441"/>
-            </w:tcBorders>
-            <w:tcMar>
-              <w:top w:w="135" w:type="dxa"/>
-              <w:left w:w="150" w:type="dxa"/>
-              <w:bottom w:w="135" w:type="dxa"/>
-              <w:right w:w="150" w:type="dxa"/>
-            </w:tcMar>
-            <w:hideMark/>
-          </w:tcPr>
-          <w:p>
-            <w:pPr>
-              <w:rPr>
-                <w:rFonts w:ascii="Times New Roman" w:hAnsi="Times New Roman" w:cs="Times New Roman"/>
-              </w:rPr>
-            </w:pPr>
-            <w:r>
-              <w:rPr>
-                <w:rFonts w:ascii="Times New Roman" w:hAnsi="Times New Roman" w:cs="Times New Roman"/>
-              </w:rPr>
-              <w:t>Stable service, general knowledge applied — check Consumption tier limits before Phase 0</w:t>
-            </w:r>
-          </w:p>
-        </w:tc>
-      </w:tr>
-      <w:tr>
-        <w:tc>
-          <w:tcPr>
-            <w:tcW w:w="0" w:type="auto"/>
-            <w:tcBorders>
-              <w:bottom w:val="single" w:sz="4" w:space="0" w:color="444441"/>
-            </w:tcBorders>
-            <w:tcMar>
-              <w:top w:w="135" w:type="dxa"/>
-              <w:left w:w="150" w:type="dxa"/>
-              <w:bottom w:w="135" w:type="dxa"/>
-              <w:right w:w="150" w:type="dxa"/>
-            </w:tcMar>
-            <w:hideMark/>
-          </w:tcPr>
-          <w:p>
-            <w:pPr>
-              <w:rPr>
-                <w:rFonts w:ascii="Times New Roman" w:hAnsi="Times New Roman" w:cs="Times New Roman"/>
-              </w:rPr>
-            </w:pPr>
-            <w:r>
-              <w:rPr>
-                <w:rFonts w:ascii="Times New Roman" w:hAnsi="Times New Roman" w:cs="Times New Roman"/>
-              </w:rPr>
-              <w:t>Microsoft Entra ID</w:t>
-            </w:r>
-          </w:p>
-        </w:tc>
-        <w:tc>
-          <w:tcPr>
-            <w:tcW w:w="0" w:type="auto"/>
-            <w:tcBorders>
-              <w:bottom w:val="single" w:sz="4" w:space="0" w:color="444441"/>
-            </w:tcBorders>
-            <w:tcMar>
-              <w:top w:w="135" w:type="dxa"/>
-              <w:left w:w="150" w:type="dxa"/>
-              <w:bottom w:w="135" w:type="dxa"/>
-              <w:right w:w="150" w:type="dxa"/>
-            </w:tcMar>
-            <w:hideMark/>
-          </w:tcPr>
-          <w:p>
-            <w:pPr>
-              <w:rPr>
-                <w:rFonts w:ascii="Times New Roman" w:hAnsi="Times New Roman" w:cs="Times New Roman"/>
-              </w:rPr>
-            </w:pPr>
-            <w:r>
-              <w:rPr>
-                <w:rFonts w:ascii="Times New Roman" w:hAnsi="Times New Roman" w:cs="Times New Roman"/>
-              </w:rPr>
-              <w:t>Stable service, general knowledge applied — check Conditional Access licensing before customer deployment</w:t>
-            </w:r>
-          </w:p>
-        </w:tc>
-      </w:tr>
-      <w:tr>
-        <w:tc>
-          <w:tcPr>
-            <w:tcW w:w="0" w:type="auto"/>
-            <w:tcBorders>
-              <w:bottom w:val="single" w:sz="4" w:space="0" w:color="444441"/>
-            </w:tcBorders>
-            <w:tcMar>
-              <w:top w:w="135" w:type="dxa"/>
-              <w:left w:w="150" w:type="dxa"/>
-              <w:bottom w:w="135" w:type="dxa"/>
-              <w:right w:w="150" w:type="dxa"/>
-            </w:tcMar>
-            <w:hideMark/>
-          </w:tcPr>
-          <w:p>
-            <w:pPr>
-              <w:rPr>
-                <w:rFonts w:ascii="Times New Roman" w:hAnsi="Times New Roman" w:cs="Times New Roman"/>
-              </w:rPr>
-            </w:pPr>
-            <w:r>
-              <w:rPr>
-                <w:rFonts w:ascii="Times New Roman" w:hAnsi="Times New Roman" w:cs="Times New Roman"/>
-              </w:rPr>
-              <w:t>Microsoft Purview</w:t>
-            </w:r>
-          </w:p>
-        </w:tc>
-        <w:tc>
-          <w:tcPr>
-            <w:tcW w:w="0" w:type="auto"/>
-            <w:tcBorders>
-              <w:bottom w:val="single" w:sz="4" w:space="0" w:color="444441"/>
-            </w:tcBorders>
-            <w:tcMar>
-              <w:top w:w="135" w:type="dxa"/>
-              <w:left w:w="150" w:type="dxa"/>
-              <w:bottom w:w="135" w:type="dxa"/>
-              <w:right w:w="150" w:type="dxa"/>
-            </w:tcMar>
-            <w:hideMark/>
-          </w:tcPr>
-          <w:p>
-            <w:pPr>
-              <w:rPr>
-                <w:rFonts w:ascii="Times New Roman" w:hAnsi="Times New Roman" w:cs="Times New Roman"/>
-              </w:rPr>
-            </w:pPr>
-            <w:r>
-              <w:rPr>
-                <w:rFonts w:ascii="Times New Roman" w:hAnsi="Times New Roman" w:cs="Times New Roman"/>
-                <w:b/>
-                <w:bCs/>
-              </w:rPr>
-              <w:t>Needs fresh check</w:t>
-            </w:r>
-            <w:r>
-              <w:rPr>
-                <w:rFonts w:ascii="Times New Roman" w:hAnsi="Times New Roman" w:cs="Times New Roman"/>
-              </w:rPr>
-              <w:t xml:space="preserve"> — AI/agent-specific governance features moving fast</w:t>
-            </w:r>
-          </w:p>
-        </w:tc>
-      </w:tr>
-      <w:tr>
-        <w:tc>
-          <w:tcPr>
-            <w:tcW w:w="0" w:type="auto"/>
-            <w:tcBorders>
-              <w:bottom w:val="single" w:sz="4" w:space="0" w:color="444441"/>
-            </w:tcBorders>
-            <w:tcMar>
-              <w:top w:w="135" w:type="dxa"/>
-              <w:left w:w="150" w:type="dxa"/>
-              <w:bottom w:w="135" w:type="dxa"/>
-              <w:right w:w="150" w:type="dxa"/>
-            </w:tcMar>
-            <w:hideMark/>
-          </w:tcPr>
-          <w:p>
-            <w:pPr>
-              <w:rPr>
-                <w:rFonts w:ascii="Times New Roman" w:hAnsi="Times New Roman" w:cs="Times New Roman"/>
-              </w:rPr>
-            </w:pPr>
-            <w:r>
-              <w:rPr>
-                <w:rFonts w:ascii="Times New Roman" w:hAnsi="Times New Roman" w:cs="Times New Roman"/>
-              </w:rPr>
-              <w:t>Azure Key Vault</w:t>
-            </w:r>
-          </w:p>
-        </w:tc>
-        <w:tc>
-          <w:tcPr>
-            <w:tcW w:w="0" w:type="auto"/>
-            <w:tcBorders>
-              <w:bottom w:val="single" w:sz="4" w:space="0" w:color="444441"/>
-            </w:tcBorders>
-            <w:tcMar>
-              <w:top w:w="135" w:type="dxa"/>
-              <w:left w:w="150" w:type="dxa"/>
-              <w:bottom w:w="135" w:type="dxa"/>
-              <w:right w:w="150" w:type="dxa"/>
-            </w:tcMar>
-            <w:hideMark/>
-          </w:tcPr>
-          <w:p>
-            <w:pPr>
-              <w:rPr>
-                <w:rFonts w:ascii="Times New Roman" w:hAnsi="Times New Roman" w:cs="Times New Roman"/>
-              </w:rPr>
-            </w:pPr>
-            <w:r>
-              <w:rPr>
-                <w:rFonts w:ascii="Times New Roman" w:hAnsi="Times New Roman" w:cs="Times New Roman"/>
-              </w:rPr>
-              <w:t>Stable service, general knowledge applied</w:t>
-            </w:r>
-          </w:p>
-        </w:tc>
-      </w:tr>
-      <w:tr>
-        <w:tc>
-          <w:tcPr>
-            <w:tcW w:w="0" w:type="auto"/>
-            <w:tcBorders>
-              <w:bottom w:val="single" w:sz="4" w:space="0" w:color="444441"/>
-            </w:tcBorders>
-            <w:tcMar>
-              <w:top w:w="135" w:type="dxa"/>
-              <w:left w:w="150" w:type="dxa"/>
-              <w:bottom w:w="135" w:type="dxa"/>
-              <w:right w:w="150" w:type="dxa"/>
-            </w:tcMar>
-            <w:hideMark/>
-          </w:tcPr>
-          <w:p>
-            <w:pPr>
-              <w:rPr>
-                <w:rFonts w:ascii="Times New Roman" w:hAnsi="Times New Roman" w:cs="Times New Roman"/>
-              </w:rPr>
-            </w:pPr>
-            <w:r>
-              <w:rPr>
-                <w:rFonts w:ascii="Times New Roman" w:hAnsi="Times New Roman" w:cs="Times New Roman"/>
-              </w:rPr>
-              <w:t>SharePoint / Graph</w:t>
-            </w:r>
-          </w:p>
-        </w:tc>
-        <w:tc>
-          <w:tcPr>
-            <w:tcW w:w="0" w:type="auto"/>
-            <w:tcBorders>
-              <w:bottom w:val="single" w:sz="4" w:space="0" w:color="444441"/>
-            </w:tcBorders>
-            <w:tcMar>
-              <w:top w:w="135" w:type="dxa"/>
-              <w:left w:w="150" w:type="dxa"/>
-              <w:bottom w:w="135" w:type="dxa"/>
-              <w:right w:w="150" w:type="dxa"/>
-            </w:tcMar>
-            <w:hideMark/>
-          </w:tcPr>
-          <w:p>
-            <w:pPr>
-              <w:rPr>
-                <w:rFonts w:ascii="Times New Roman" w:hAnsi="Times New Roman" w:cs="Times New Roman"/>
-              </w:rPr>
-            </w:pPr>
-            <w:r>
-              <w:rPr>
-                <w:rFonts w:ascii="Times New Roman" w:hAnsi="Times New Roman" w:cs="Times New Roman"/>
-              </w:rPr>
-              <w:t>Stable service, general knowledge applied — check Graph permission scopes before Phase 4</w:t>
-            </w:r>
-          </w:p>
-        </w:tc>
-      </w:tr>
-      <w:tr>
-        <w:tc>
-          <w:tcPr>
-            <w:tcW w:w="0" w:type="auto"/>
-            <w:tcBorders>
-              <w:bottom w:val="single" w:sz="4" w:space="0" w:color="444441"/>
-            </w:tcBorders>
-            <w:tcMar>
-              <w:top w:w="135" w:type="dxa"/>
-              <w:left w:w="150" w:type="dxa"/>
-              <w:bottom w:w="135" w:type="dxa"/>
-              <w:right w:w="150" w:type="dxa"/>
-            </w:tcMar>
-            <w:hideMark/>
-          </w:tcPr>
-          <w:p>
-            <w:pPr>
-              <w:rPr>
-                <w:rFonts w:ascii="Times New Roman" w:hAnsi="Times New Roman" w:cs="Times New Roman"/>
-              </w:rPr>
-            </w:pPr>
-            <w:r>
-              <w:rPr>
-                <w:rFonts w:ascii="Times New Roman" w:hAnsi="Times New Roman" w:cs="Times New Roman"/>
-              </w:rPr>
-              <w:t>Microsoft Defender</w:t>
-            </w:r>
-          </w:p>
-        </w:tc>
-        <w:tc>
-          <w:tcPr>
-            <w:tcW w:w="0" w:type="auto"/>
-            <w:tcBorders>
-              <w:bottom w:val="single" w:sz="4" w:space="0" w:color="444441"/>
-            </w:tcBorders>
-            <w:tcMar>
-              <w:top w:w="135" w:type="dxa"/>
-              <w:left w:w="150" w:type="dxa"/>
-              <w:bottom w:w="135" w:type="dxa"/>
-              <w:right w:w="150" w:type="dxa"/>
-            </w:tcMar>
-            <w:hideMark/>
-          </w:tcPr>
-          <w:p>
-            <w:pPr>
-              <w:rPr>
-                <w:rFonts w:ascii="Times New Roman" w:hAnsi="Times New Roman" w:cs="Times New Roman"/>
-              </w:rPr>
-            </w:pPr>
-            <w:r>
-              <w:rPr>
-                <w:rFonts w:ascii="Times New Roman" w:hAnsi="Times New Roman" w:cs="Times New Roman"/>
-                <w:b/>
-                <w:bCs/>
-              </w:rPr>
-              <w:t>Needs fresh check</w:t>
-            </w:r>
-            <w:r>
-              <w:rPr>
-                <w:rFonts w:ascii="Times New Roman" w:hAnsi="Times New Roman" w:cs="Times New Roman"/>
-              </w:rPr>
-              <w:t xml:space="preserve"> — Defender-for-AI/agent coverage moving fast, relevant for Phase 6</w:t>
-            </w:r>
-          </w:p>
-        </w:tc>
-      </w:tr>
-      <w:tr>
-        <w:tc>
-          <w:tcPr>
-            <w:tcW w:w="0" w:type="auto"/>
-            <w:tcBorders>
-              <w:bottom w:val="single" w:sz="4" w:space="0" w:color="444441"/>
-            </w:tcBorders>
-            <w:tcMar>
-              <w:top w:w="135" w:type="dxa"/>
-              <w:left w:w="150" w:type="dxa"/>
-              <w:bottom w:w="135" w:type="dxa"/>
-              <w:right w:w="150" w:type="dxa"/>
-            </w:tcMar>
-            <w:hideMark/>
-          </w:tcPr>
-          <w:p>
-            <w:pPr>
-              <w:rPr>
-                <w:rFonts w:ascii="Times New Roman" w:hAnsi="Times New Roman" w:cs="Times New Roman"/>
-              </w:rPr>
-            </w:pPr>
-            <w:r>
-              <w:rPr>
-                <w:rFonts w:ascii="Times New Roman" w:hAnsi="Times New Roman" w:cs="Times New Roman"/>
-              </w:rPr>
-              <w:t>Azure AI Search</w:t>
-            </w:r>
-          </w:p>
-        </w:tc>
-        <w:tc>
-          <w:tcPr>
-            <w:tcW w:w="0" w:type="auto"/>
-            <w:tcBorders>
-              <w:bottom w:val="single" w:sz="4" w:space="0" w:color="444441"/>
-            </w:tcBorders>
-            <w:tcMar>
-              <w:top w:w="135" w:type="dxa"/>
-              <w:left w:w="150" w:type="dxa"/>
-              <w:bottom w:w="135" w:type="dxa"/>
-              <w:right w:w="150" w:type="dxa"/>
-            </w:tcMar>
-            <w:hideMark/>
-          </w:tcPr>
-          <w:p>
-            <w:pPr>
-              <w:rPr>
-                <w:rFonts w:ascii="Times New Roman" w:hAnsi="Times New Roman" w:cs="Times New Roman"/>
-              </w:rPr>
-            </w:pPr>
-            <w:r>
-              <w:rPr>
-                <w:rFonts w:ascii="Times New Roman" w:hAnsi="Times New Roman" w:cs="Times New Roman"/>
-              </w:rPr>
-              <w:t>Stable service, general knowledge applied — check free-tier index limits</w:t>
-            </w:r>
-          </w:p>
-        </w:tc>
-      </w:tr>
-      <w:tr>
-        <w:tc>
-          <w:tcPr>
-            <w:tcW w:w="0" w:type="auto"/>
-            <w:tcBorders>
-              <w:bottom w:val="single" w:sz="4" w:space="0" w:color="444441"/>
-            </w:tcBorders>
-            <w:tcMar>
-              <w:top w:w="135" w:type="dxa"/>
-              <w:left w:w="150" w:type="dxa"/>
-              <w:bottom w:w="135" w:type="dxa"/>
-              <w:right w:w="150" w:type="dxa"/>
-            </w:tcMar>
-            <w:hideMark/>
-          </w:tcPr>
-          <w:p>
-            <w:pPr>
-              <w:rPr>
-                <w:rFonts w:ascii="Times New Roman" w:hAnsi="Times New Roman" w:cs="Times New Roman"/>
-              </w:rPr>
-            </w:pPr>
-            <w:r>
-              <w:rPr>
-                <w:rFonts w:ascii="Times New Roman" w:hAnsi="Times New Roman" w:cs="Times New Roman"/>
-              </w:rPr>
-              <w:t>Application Insights</w:t>
-            </w:r>
-          </w:p>
-        </w:tc>
-        <w:tc>
-          <w:tcPr>
-            <w:tcW w:w="0" w:type="auto"/>
-            <w:tcBorders>
-              <w:bottom w:val="single" w:sz="4" w:space="0" w:color="444441"/>
-            </w:tcBorders>
-            <w:tcMar>
-              <w:top w:w="135" w:type="dxa"/>
-              <w:left w:w="150" w:type="dxa"/>
-              <w:bottom w:w="135" w:type="dxa"/>
-              <w:right w:w="150" w:type="dxa"/>
-            </w:tcMar>
-            <w:hideMark/>
-          </w:tcPr>
-          <w:p>
-            <w:pPr>
-              <w:rPr>
-                <w:rFonts w:ascii="Times New Roman" w:hAnsi="Times New Roman" w:cs="Times New Roman"/>
-              </w:rPr>
-            </w:pPr>
-            <w:r>
-              <w:rPr>
-                <w:rFonts w:ascii="Times New Roman" w:hAnsi="Times New Roman" w:cs="Times New Roman"/>
-              </w:rPr>
-              <w:t>Stable service, general knowledge applied</w:t>
-            </w:r>
-          </w:p>
-        </w:tc>
-      </w:tr>
-      <w:tr>
-        <w:tc>
-          <w:tcPr>
-            <w:tcW w:w="0" w:type="auto"/>
-            <w:tcBorders>
-              <w:bottom w:val="single" w:sz="4" w:space="0" w:color="444441"/>
-            </w:tcBorders>
-            <w:tcMar>
-              <w:top w:w="135" w:type="dxa"/>
-              <w:left w:w="150" w:type="dxa"/>
-              <w:bottom w:w="135" w:type="dxa"/>
-              <w:right w:w="150" w:type="dxa"/>
-            </w:tcMar>
-            <w:hideMark/>
-          </w:tcPr>
-          <w:p>
-            <w:pPr>
-              <w:rPr>
-                <w:rFonts w:ascii="Times New Roman" w:hAnsi="Times New Roman" w:cs="Times New Roman"/>
-              </w:rPr>
-            </w:pPr>
-            <w:r>
-              <w:rPr>
-                <w:rFonts w:ascii="Times New Roman" w:hAnsi="Times New Roman" w:cs="Times New Roman"/>
-              </w:rPr>
-              <w:t>Power Platform</w:t>
-            </w:r>
-          </w:p>
-        </w:tc>
-        <w:tc>
-          <w:tcPr>
-            <w:tcW w:w="0" w:type="auto"/>
-            <w:tcBorders>
-              <w:bottom w:val="single" w:sz="4" w:space="0" w:color="444441"/>
-            </w:tcBorders>
-            <w:tcMar>
-              <w:top w:w="135" w:type="dxa"/>
-              <w:left w:w="150" w:type="dxa"/>
-              <w:bottom w:w="135" w:type="dxa"/>
-              <w:right w:w="150" w:type="dxa"/>
-            </w:tcMar>
-            <w:hideMark/>
-          </w:tcPr>
-          <w:p>
-            <w:pPr>
-              <w:rPr>
-                <w:rFonts w:ascii="Times New Roman" w:hAnsi="Times New Roman" w:cs="Times New Roman"/>
-              </w:rPr>
-            </w:pPr>
-            <w:r>
-              <w:rPr>
-                <w:rFonts w:ascii="Times New Roman" w:hAnsi="Times New Roman" w:cs="Times New Roman"/>
-              </w:rPr>
-              <w:t>Stable service, general knowledge applied — optional dependency only</w:t>
-            </w:r>
-          </w:p>
-        </w:tc>
-      </w:tr>
-    </w:tbl>
-    <w:p>
-      <w:pPr>
-        <w:rPr>
-          <w:rFonts w:ascii="Times New Roman" w:hAnsi="Times New Roman" w:cs="Times New Roman"/>
-          <w:b/>
-          <w:bCs/>
-        </w:rPr>
-      </w:pPr>
-      <w:r>
-        <w:rPr>
-          <w:rFonts w:ascii="Times New Roman" w:hAnsi="Times New Roman" w:cs="Times New Roman"/>
-          <w:b/>
-          <w:bCs/>
-        </w:rPr>
-        <w:t>15. Open questions</w:t>
-      </w:r>
-    </w:p>
-    <w:p>
-      <w:pPr>
-        <w:numPr>
-          <w:ilvl w:val="0"/>
-          <w:numId w:val="6"/>
-        </w:numPr>
-        <w:rPr>
-          <w:rFonts w:ascii="Times New Roman" w:hAnsi="Times New Roman" w:cs="Times New Roman"/>
-        </w:rPr>
-      </w:pPr>
-      <w:r>
-        <w:rPr>
-          <w:rFonts w:ascii="Times New Roman" w:hAnsi="Times New Roman" w:cs="Times New Roman"/>
-        </w:rPr>
-        <w:t>Which customer tenant (if any) is the actual target for the first real deployment, vs. building against your own dev tenant only?</w:t>
-      </w:r>
-    </w:p>
-    <w:p>
-      <w:pPr>
-        <w:numPr>
-          <w:ilvl w:val="0"/>
-          <w:numId w:val="6"/>
-        </w:numPr>
-        <w:rPr>
-          <w:rFonts w:ascii="Times New Roman" w:hAnsi="Times New Roman" w:cs="Times New Roman"/>
-        </w:rPr>
-      </w:pPr>
-      <w:r>
-        <w:rPr>
-          <w:rFonts w:ascii="Times New Roman" w:hAnsi="Times New Roman" w:cs="Times New Roman"/>
-        </w:rPr>
-        <w:t>Does the dev tenant have a real Microsoft 365/SharePoint presence, or does Phase 4+ need a seeded test tenant?</w:t>
-      </w:r>
-    </w:p>
-    <w:p>
-      <w:pPr>
-        <w:numPr>
-          <w:ilvl w:val="0"/>
-          <w:numId w:val="6"/>
-        </w:numPr>
-        <w:rPr>
-          <w:rFonts w:ascii="Times New Roman" w:hAnsi="Times New Roman" w:cs="Times New Roman"/>
-        </w:rPr>
-      </w:pPr>
-      <w:r>
-        <w:rPr>
-          <w:rFonts w:ascii="Times New Roman" w:hAnsi="Times New Roman" w:cs="Times New Roman"/>
-        </w:rPr>
-        <w:t>Backend language choice: Node.js or Python for Azure Functions — not yet decided.</w:t>
-      </w:r>
-    </w:p>
-    <w:p>
-      <w:pPr>
-        <w:numPr>
-          <w:ilvl w:val="0"/>
-          <w:numId w:val="6"/>
-        </w:numPr>
-        <w:rPr>
-          <w:rFonts w:ascii="Times New Roman" w:hAnsi="Times New Roman" w:cs="Times New Roman"/>
-        </w:rPr>
-      </w:pPr>
-      <w:r>
-        <w:rPr>
-          <w:rFonts w:ascii="Times New Roman" w:hAnsi="Times New Roman" w:cs="Times New Roman"/>
-        </w:rPr>
-        <w:t>When does Agent 365 licensing get introduced — MVP, or only once there's a paying customer tenant?</w:t>
+      </w:pPr>
+      <w:r>
+        <w:rPr>
+          <w:rFonts w:ascii="Times New Roman" w:hAnsi="Times New Roman" w:cs="Times New Roman"/>
+        </w:rPr>
+        <w:t xml:space="preserve">The first implementation should deliberately avoid building a second full AI platform. Foundry, Entra, Microsoft 365 Agent Registry/Agent 365, Purview, Azure API Management and the approved Microsoft/Azure services should provide the underlying platform capabilities. CREDO's IP should sit in the Factory experience, templates, policy orchestration, enterprise tool/data </w:t>
+      </w:r>
+      <w:proofErr w:type="spellStart"/>
+      <w:r>
+        <w:rPr>
+          <w:rFonts w:ascii="Times New Roman" w:hAnsi="Times New Roman" w:cs="Times New Roman"/>
+        </w:rPr>
+        <w:t>catalog</w:t>
+      </w:r>
+      <w:proofErr w:type="spellEnd"/>
+      <w:r>
+        <w:rPr>
+          <w:rFonts w:ascii="Times New Roman" w:hAnsi="Times New Roman" w:cs="Times New Roman"/>
+        </w:rPr>
+        <w:t>, approval model, deployment patterns and managed operating model. That keeps the offering aligned with Microsoft's platform while giving CREDO a repeatable accelerator that can be deployed into multiple customer tenants</w:t>
       </w:r>
     </w:p>
     <w:p>
@@ -7727,6 +6912,24 @@
 <file path=word/numbering.xml><?xml version="1.0" encoding="utf-8"?>
 <w:numbering xmlns:wpc="http://schemas.microsoft.com/office/word/2010/wordprocessingCanvas" xmlns:cx="http://schemas.microsoft.com/office/drawing/2014/chartex" xmlns:cx1="http://schemas.microsoft.com/office/drawing/2015/9/8/chartex" xmlns:cx2="http://schemas.microsoft.com/office/drawing/2015/10/21/chartex" xmlns:cx3="http://schemas.microsoft.com/office/drawing/2016/5/9/chartex" xmlns:cx4="http://schemas.microsoft.com/office/drawing/2016/5/10/chartex" xmlns:cx5="http://schemas.microsoft.com/office/drawing/2016/5/11/chartex" xmlns:cx6="http://schemas.microsoft.com/office/drawing/2016/5/12/chartex" xmlns:cx7="http://schemas.microsoft.com/office/drawing/2016/5/13/chartex" xmlns:cx8="http://schemas.microsoft.com/office/drawing/2016/5/14/chartex" xmlns:mc="http://schemas.openxmlformats.org/markup-compatibility/2006" xmlns:aink="http://schemas.microsoft.com/office/drawing/2016/ink" xmlns:am3d="http://schemas.microsoft.com/office/drawing/2017/model3d" xmlns:o="urn:schemas-microsoft-com:office:office" xmlns:oel="http://schemas.microsoft.com/office/2019/extlst" xmlns:r="http://schemas.openxmlformats.org/officeDocument/2006/relationships" xmlns:m="http://schemas.openxmlformats.org/officeDocument/2006/math" xmlns:v="urn:schemas-microsoft-com:vml" xmlns:wp14="http://schemas.microsoft.com/office/word/2010/wordprocessingDrawing" xmlns:wp="http://schemas.openxmlformats.org/drawingml/2006/wordprocessingDrawing" xmlns:w10="urn:schemas-microsoft-com:office:word" xmlns:w="http://schemas.openxmlformats.org/wordprocessingml/2006/main" xmlns:w14="http://schemas.microsoft.com/office/word/2010/wordml" xmlns:w15="http://schemas.microsoft.com/office/word/2012/wordml" xmlns:w16cex="http://schemas.microsoft.com/office/word/2018/wordml/cex" xmlns:w16cid="http://schemas.microsoft.com/office/word/2016/wordml/cid" xmlns:w16="http://schemas.microsoft.com/office/word/2018/wordml" xmlns:w16du="http://schemas.microsoft.com/office/word/2023/wordml/word16du" xmlns:w16sdtdh="http://schemas.microsoft.com/office/word/2020/wordml/sdtdatahash" xmlns:w16sdtfl="http://schemas.microsoft.com/office/word/2024/wordml/sdtformatlock" xmlns:w16se="http://schemas.microsoft.com/office/word/2015/wordml/symex" xmlns:wpg="http://schemas.microsoft.com/office/word/2010/wordprocessingGroup" xmlns:wpi="http://schemas.microsoft.com/office/word/2010/wordprocessingInk" xmlns:wne="http://schemas.microsoft.com/office/word/2006/wordml" xmlns:wps="http://schemas.microsoft.com/office/word/2010/wordprocessingShape" mc:Ignorable="w14 w15 w16se w16cid w16 w16cex w16sdtdh w16sdtfl w16du wp14">
   <w:abstractNum w:abstractNumId="0" w15:restartNumberingAfterBreak="0">
+    <w:nsid w:val="FFFFFF88"/>
+    <w:multiLevelType w:val="singleLevel"/>
+    <w:tmpl w:val="BEFAF832"/>
+    <w:lvl w:ilvl="0">
+      <w:start w:val="1"/>
+      <w:numFmt w:val="decimal"/>
+      <w:pStyle w:val="ListNumber"/>
+      <w:lvlText w:val="%1."/>
+      <w:lvlJc w:val="left"/>
+      <w:pPr>
+        <w:tabs>
+          <w:tab w:val="num" w:pos="360"/>
+        </w:tabs>
+        <w:ind w:left="360" w:hanging="360"/>
+      </w:pPr>
+    </w:lvl>
+  </w:abstractNum>
+  <w:abstractNum w:abstractNumId="1" w15:restartNumberingAfterBreak="0">
     <w:nsid w:val="10A66C56"/>
     <w:multiLevelType w:val="multilevel"/>
     <w:tmpl w:val="BA0C02A0"/>
@@ -7839,7 +7042,7 @@
       </w:pPr>
     </w:lvl>
   </w:abstractNum>
-  <w:abstractNum w:abstractNumId="1" w15:restartNumberingAfterBreak="0">
+  <w:abstractNum w:abstractNumId="2" w15:restartNumberingAfterBreak="0">
     <w:nsid w:val="31E14362"/>
     <w:multiLevelType w:val="multilevel"/>
     <w:tmpl w:val="A4DCF3CE"/>
@@ -7988,7 +7191,7 @@
       </w:rPr>
     </w:lvl>
   </w:abstractNum>
-  <w:abstractNum w:abstractNumId="2" w15:restartNumberingAfterBreak="0">
+  <w:abstractNum w:abstractNumId="3" w15:restartNumberingAfterBreak="0">
     <w:nsid w:val="372A747C"/>
     <w:multiLevelType w:val="multilevel"/>
     <w:tmpl w:val="F9723384"/>
@@ -8137,7 +7340,7 @@
       </w:rPr>
     </w:lvl>
   </w:abstractNum>
-  <w:abstractNum w:abstractNumId="3" w15:restartNumberingAfterBreak="0">
+  <w:abstractNum w:abstractNumId="4" w15:restartNumberingAfterBreak="0">
     <w:nsid w:val="64FB447E"/>
     <w:multiLevelType w:val="multilevel"/>
     <w:tmpl w:val="A9C213B2"/>
@@ -8250,7 +7453,7 @@
       </w:pPr>
     </w:lvl>
   </w:abstractNum>
-  <w:abstractNum w:abstractNumId="4" w15:restartNumberingAfterBreak="0">
+  <w:abstractNum w:abstractNumId="5" w15:restartNumberingAfterBreak="0">
     <w:nsid w:val="681C3508"/>
     <w:multiLevelType w:val="multilevel"/>
     <w:tmpl w:val="44BC699C"/>
@@ -8399,7 +7602,7 @@
       </w:rPr>
     </w:lvl>
   </w:abstractNum>
-  <w:abstractNum w:abstractNumId="5" w15:restartNumberingAfterBreak="0">
+  <w:abstractNum w:abstractNumId="6" w15:restartNumberingAfterBreak="0">
     <w:nsid w:val="7A281AE7"/>
     <w:multiLevelType w:val="multilevel"/>
     <w:tmpl w:val="B1B62682"/>
@@ -8513,22 +7716,25 @@
     </w:lvl>
   </w:abstractNum>
   <w:num w:numId="1" w16cid:durableId="915475656">
-    <w:abstractNumId w:val="0"/>
+    <w:abstractNumId w:val="1"/>
   </w:num>
   <w:num w:numId="2" w16cid:durableId="1548954249">
+    <w:abstractNumId w:val="6"/>
+  </w:num>
+  <w:num w:numId="3" w16cid:durableId="2097171870">
+    <w:abstractNumId w:val="4"/>
+  </w:num>
+  <w:num w:numId="4" w16cid:durableId="1909917453">
     <w:abstractNumId w:val="5"/>
   </w:num>
-  <w:num w:numId="3" w16cid:durableId="2097171870">
+  <w:num w:numId="5" w16cid:durableId="1389499922">
     <w:abstractNumId w:val="3"/>
   </w:num>
-  <w:num w:numId="4" w16cid:durableId="1909917453">
-    <w:abstractNumId w:val="4"/>
-  </w:num>
-  <w:num w:numId="5" w16cid:durableId="1389499922">
+  <w:num w:numId="6" w16cid:durableId="1488396789">
     <w:abstractNumId w:val="2"/>
   </w:num>
-  <w:num w:numId="6" w16cid:durableId="1488396789">
-    <w:abstractNumId w:val="1"/>
+  <w:num w:numId="7" w16cid:durableId="1630941830">
+    <w:abstractNumId w:val="0"/>
   </w:num>
 </w:numbering>
 </file>
@@ -9136,6 +8342,7 @@
   <w:style w:type="character" w:default="1" w:styleId="DefaultParagraphFont">
     <w:name w:val="Default Paragraph Font"/>
     <w:uiPriority w:val="1"/>
+    <w:semiHidden/>
     <w:unhideWhenUsed/>
   </w:style>
   <w:style w:type="table" w:default="1" w:styleId="TableNormal">
@@ -9484,6 +8691,31 @@
       <w:u w:val="single"/>
     </w:rPr>
   </w:style>
+  <w:style w:type="paragraph" w:styleId="ListNumber">
+    <w:name w:val="List Number"/>
+    <w:basedOn w:val="Normal"/>
+    <w:uiPriority w:val="99"/>
+    <w:unhideWhenUsed/>
+    <w:rsid w:val="008C2A2B"/>
+    <w:pPr>
+      <w:numPr>
+        <w:numId w:val="7"/>
+      </w:numPr>
+      <w:tabs>
+        <w:tab w:val="clear" w:pos="360"/>
+      </w:tabs>
+      <w:spacing w:after="200" w:line="276" w:lineRule="auto"/>
+      <w:ind w:left="0" w:firstLine="0"/>
+      <w:contextualSpacing/>
+    </w:pPr>
+    <w:rPr>
+      <w:rFonts w:ascii="Aptos" w:eastAsiaTheme="minorEastAsia" w:hAnsi="Aptos"/>
+      <w:kern w:val="0"/>
+      <w:sz w:val="19"/>
+      <w:lang w:val="en-US"/>
+      <w14:ligatures w14:val="none"/>
+    </w:rPr>
+  </w:style>
 </w:styles>
 </file>
 
@@ -9780,4 +9012,16 @@
     </a:ext>
   </a:extLst>
 </a:theme>
+</file>
+
+<file path=customXml/item1.xml><?xml version="1.0" encoding="utf-8"?>
+<b:Sources xmlns:b="http://schemas.openxmlformats.org/officeDocument/2006/bibliography" xmlns="http://schemas.openxmlformats.org/officeDocument/2006/bibliography" SelectedStyle="\APASixthEditionOfficeOnline.xsl" StyleName="APA" Version="6"/>
+</file>
+
+<file path=customXml/itemProps1.xml><?xml version="1.0" encoding="utf-8"?>
+<ds:datastoreItem xmlns:ds="http://schemas.openxmlformats.org/officeDocument/2006/customXml" ds:itemID="{73FD6B6D-A32E-4BE9-8439-2908B7C0399B}">
+  <ds:schemaRefs>
+    <ds:schemaRef ds:uri="http://schemas.openxmlformats.org/officeDocument/2006/bibliography"/>
+  </ds:schemaRefs>
+</ds:datastoreItem>
 </file>
</xml_diff>

<commit_message>
changed the knowledge and tool page
</commit_message>
<xml_diff>
--- a/Project-Plan.docx
+++ b/Project-Plan.docx
@@ -5728,12 +5728,6 @@
                 <w:rFonts w:ascii="Times New Roman" w:hAnsi="Times New Roman" w:cs="Times New Roman"/>
               </w:rPr>
             </w:pPr>
-            <w:r>
-              <w:rPr>
-                <w:rFonts w:ascii="Times New Roman" w:hAnsi="Times New Roman" w:cs="Times New Roman"/>
-              </w:rPr>
-              <w:t>Don't over-engineer for MVP</w:t>
-            </w:r>
           </w:p>
         </w:tc>
       </w:tr>
@@ -6571,15 +6565,7 @@
           <w:b/>
           <w:bCs/>
         </w:rPr>
-        <w:t xml:space="preserve">13. </w:t>
-      </w:r>
-      <w:r>
-        <w:rPr>
-          <w:rFonts w:ascii="Times New Roman" w:hAnsi="Times New Roman" w:cs="Times New Roman"/>
-          <w:b/>
-          <w:bCs/>
-        </w:rPr>
-        <w:t>Foundry Architecture Pattern</w:t>
+        <w:t>13. Foundry Architecture Pattern</w:t>
       </w:r>
     </w:p>
     <w:p>
@@ -6774,29 +6760,30 @@
           <w:b/>
           <w:bCs/>
         </w:rPr>
-        <w:t xml:space="preserve">. </w:t>
-      </w:r>
-      <w:r>
+        <w:t>. Example Customer Journey</w:t>
+      </w:r>
+    </w:p>
+    <w:p>
+      <w:pPr>
+        <w:rPr>
+          <w:rFonts w:ascii="Times New Roman" w:hAnsi="Times New Roman" w:cs="Times New Roman"/>
+        </w:rPr>
+      </w:pPr>
+      <w:r>
+        <w:rPr>
+          <w:rFonts w:ascii="Times New Roman" w:hAnsi="Times New Roman" w:cs="Times New Roman"/>
+        </w:rPr>
+        <w:t>A Finance Manager enters: 'I want an agent that reviews supplier invoices against our procurement policy and flags exceptions.' The Factory identifies Finance + document analysis + approved procurement knowledge. The user selects the procurement SharePoint library and an approved invoice-processing API. The policy engine sees that the agent is read-only and internal, assigns a low/medium risk class, creates the test agent in Foundry, runs evaluation cases, and submits it for the configured approval route. Once approved, the agent is published to the selected audience. The Finance Manager can later update the agent through a new version without requiring CREDO to rebuild it from scratch.</w:t>
+      </w:r>
+    </w:p>
+    <w:p>
+      <w:pPr>
         <w:rPr>
           <w:rFonts w:ascii="Times New Roman" w:hAnsi="Times New Roman" w:cs="Times New Roman"/>
           <w:b/>
           <w:bCs/>
         </w:rPr>
-        <w:t>Example Customer Journey</w:t>
-      </w:r>
-    </w:p>
-    <w:p>
-      <w:pPr>
-        <w:rPr>
-          <w:rFonts w:ascii="Times New Roman" w:hAnsi="Times New Roman" w:cs="Times New Roman"/>
-        </w:rPr>
-      </w:pPr>
-      <w:r>
-        <w:rPr>
-          <w:rFonts w:ascii="Times New Roman" w:hAnsi="Times New Roman" w:cs="Times New Roman"/>
-        </w:rPr>
-        <w:t>A Finance Manager enters: 'I want an agent that reviews supplier invoices against our procurement policy and flags exceptions.' The Factory identifies Finance + document analysis + approved procurement knowledge. The user selects the procurement SharePoint library and an approved invoice-processing API. The policy engine sees that the agent is read-only and internal, assigns a low/medium risk class, creates the test agent in Foundry, runs evaluation cases, and submits it for the configured approval route. Once approved, the agent is published to the selected audience. The Finance Manager can later update the agent through a new version without requiring CREDO to rebuild it from scratch.</w:t>
-      </w:r>
+      </w:pPr>
     </w:p>
     <w:p>
       <w:pPr>
@@ -6806,30 +6793,13 @@
           <w:bCs/>
         </w:rPr>
       </w:pPr>
-    </w:p>
-    <w:p>
-      <w:pPr>
+      <w:r>
         <w:rPr>
           <w:rFonts w:ascii="Times New Roman" w:hAnsi="Times New Roman" w:cs="Times New Roman"/>
           <w:b/>
           <w:bCs/>
         </w:rPr>
-      </w:pPr>
-      <w:r>
-        <w:rPr>
-          <w:rFonts w:ascii="Times New Roman" w:hAnsi="Times New Roman" w:cs="Times New Roman"/>
-          <w:b/>
-          <w:bCs/>
-        </w:rPr>
-        <w:t xml:space="preserve">15. </w:t>
-      </w:r>
-      <w:r>
-        <w:rPr>
-          <w:rFonts w:ascii="Times New Roman" w:hAnsi="Times New Roman" w:cs="Times New Roman"/>
-          <w:b/>
-          <w:bCs/>
-        </w:rPr>
-        <w:t>Important Architecture Decision</w:t>
+        <w:t>15. Important Architecture Decision</w:t>
       </w:r>
     </w:p>
     <w:p>

</xml_diff>